<commit_message>
Streamline academic report and end with references
</commit_message>
<xml_diff>
--- a/reports/VTU_BDA_Track_B_Report.docx
+++ b/reports/VTU_BDA_Track_B_Report.docx
@@ -3,7 +3,7 @@
 <w:document xmlns:wpc="http://schemas.microsoft.com/office/word/2010/wordprocessingCanvas" xmlns:mo="http://schemas.microsoft.com/office/mac/office/2008/main" xmlns:mc="http://schemas.openxmlformats.org/markup-compatibility/2006" xmlns:mv="urn:schemas-microsoft-com:mac:vml" xmlns:o="urn:schemas-microsoft-com:office:office" xmlns:r="http://schemas.openxmlformats.org/officeDocument/2006/relationships" xmlns:m="http://schemas.openxmlformats.org/officeDocument/2006/math" xmlns:v="urn:schemas-microsoft-com:vml" xmlns:wp14="http://schemas.microsoft.com/office/word/2010/wordprocessingDrawing" xmlns:wp="http://schemas.openxmlformats.org/drawingml/2006/wordprocessingDrawing" xmlns:w10="urn:schemas-microsoft-com:office:word" xmlns:w="http://schemas.openxmlformats.org/wordprocessingml/2006/main" xmlns:w14="http://schemas.microsoft.com/office/word/2010/wordml" xmlns:wpg="http://schemas.microsoft.com/office/word/2010/wordprocessingGroup" xmlns:wpi="http://schemas.microsoft.com/office/word/2010/wordprocessingInk" xmlns:wne="http://schemas.microsoft.com/office/word/2006/wordml" xmlns:wps="http://schemas.microsoft.com/office/word/2010/wordprocessingShape" mc:Ignorable="w14 wp14">
   <w:body>
     <w:p>
-      <w:bookmarkStart w:id="26" w:name="cover"/>
+      <w:bookmarkStart w:id="21" w:name="cover"/>
       <w:pPr>
         <w:pStyle w:val="Heading2"/>
         <w:spacing w:after="120"/>
@@ -17,7 +17,7 @@
         </w:rPr>
         <w:t>VISVESVARAYA TECHNOLOGICAL UNIVERSITY, BELAGAVI</w:t>
       </w:r>
-      <w:bookmarkEnd w:id="26"/>
+      <w:bookmarkEnd w:id="21"/>
     </w:p>
     <w:p>
       <w:pPr>
@@ -751,7 +751,7 @@
       </w:r>
     </w:p>
     <w:p>
-      <w:bookmarkStart w:id="27" w:name="abstract"/>
+      <w:bookmarkStart w:id="22" w:name="abstract"/>
       <w:pPr>
         <w:pStyle w:val="Heading2"/>
         <w:jc w:val="both"/>
@@ -764,7 +764,7 @@
         </w:rPr>
         <w:t>ABSTRACT</w:t>
       </w:r>
-      <w:bookmarkEnd w:id="27"/>
+      <w:bookmarkEnd w:id="22"/>
     </w:p>
     <w:p>
       <w:pPr>
@@ -802,7 +802,7 @@
           <w:sz w:val="24"/>
           <w:rFonts w:ascii="Times New Roman" w:hAnsi="Times New Roman" w:eastAsia="Times New Roman" w:cs="Times New Roman"/>
         </w:rPr>
-        <w:t>Correctness is established by source fingerprints, input accounting and independent reconciliation of group counts, totals and means. The report distinguishes observed development outcomes from work still pending: full-release analytical benchmarking and execution on three physical college systems. Numerical Hive runtime and storage conclusions await the original selected-run artifacts. The supplied Cloud Report is used only as a presentation reference; all technical content concerns this Big Data Analytics project.</w:t>
+        <w:t>Source fingerprints, input accounting and independent reconciliation establish consistent group counts, totals and means across the analytical systems. The reported experiments use development subsets in the laptop container environment. The dashboard presents the selected results, benchmark artifacts and live execution progress through a single interface. Together, the processing pipeline and dashboard implement the core analytical themes and the Track B practical extension.</w:t>
       </w:r>
     </w:p>
     <w:p>
@@ -1188,7 +1188,7 @@
           <w:rFonts w:ascii="Times New Roman" w:hAnsi="Times New Roman" w:eastAsia="Times New Roman" w:cs="Times New Roman"/>
           <w:sz w:val="24"/>
         </w:rPr>
-        <w:t>CHAPTER 8: DEPLOYMENT AND DEMONSTRATION</w:t>
+        <w:t>CHAPTER 8: CONCLUSION</w:t>
         <w:tab/>
       </w:r>
       <w:r>
@@ -1203,46 +1203,7 @@
             <w:rFonts w:ascii="Times New Roman" w:hAnsi="Times New Roman" w:eastAsia="Times New Roman" w:cs="Times New Roman"/>
             <w:sz w:val="24"/>
           </w:rPr>
-          <w:t>25</w:t>
-        </w:r>
-      </w:fldSimple>
-    </w:p>
-    <w:p>
-      <w:pPr>
-        <w:tabs>
-          <w:tab w:pos="8844" w:val="right" w:leader="dot"/>
-        </w:tabs>
-        <w:spacing w:after="100"/>
-        <w:jc w:val="both"/>
-      </w:pPr>
-      <w:r>
-        <w:rPr>
-          <w:b w:val="0"/>
-          <w:sz w:val="24"/>
-          <w:rFonts w:ascii="Times New Roman" w:hAnsi="Times New Roman" w:eastAsia="Times New Roman" w:cs="Times New Roman"/>
-        </w:rPr>
-      </w:r>
-      <w:r>
-        <w:rPr>
-          <w:rFonts w:ascii="Times New Roman" w:hAnsi="Times New Roman" w:eastAsia="Times New Roman" w:cs="Times New Roman"/>
-          <w:sz w:val="24"/>
-        </w:rPr>
-        <w:t>CHAPTER 9: CONCLUSION AND FUTURE WORK</w:t>
-        <w:tab/>
-      </w:r>
-      <w:r>
-        <w:rPr>
-          <w:rFonts w:ascii="Times New Roman" w:hAnsi="Times New Roman" w:eastAsia="Times New Roman" w:cs="Times New Roman"/>
-          <w:sz w:val="24"/>
-        </w:rPr>
-      </w:r>
-      <w:fldSimple w:instr="PAGEREF chapter_9 \h">
-        <w:r>
-          <w:rPr>
-            <w:rFonts w:ascii="Times New Roman" w:hAnsi="Times New Roman" w:eastAsia="Times New Roman" w:cs="Times New Roman"/>
-            <w:sz w:val="24"/>
-          </w:rPr>
-          <w:t>27</w:t>
+          <w:t>24</w:t>
         </w:r>
       </w:fldSimple>
     </w:p>
@@ -1275,91 +1236,13 @@
           <w:sz w:val="24"/>
         </w:rPr>
       </w:r>
-      <w:fldSimple w:instr="PAGEREF chapter_10 \h">
+      <w:fldSimple w:instr="PAGEREF chapter_9 \h">
         <w:r>
           <w:rPr>
             <w:rFonts w:ascii="Times New Roman" w:hAnsi="Times New Roman" w:eastAsia="Times New Roman" w:cs="Times New Roman"/>
             <w:sz w:val="24"/>
           </w:rPr>
-          <w:t>28</w:t>
-        </w:r>
-      </w:fldSimple>
-    </w:p>
-    <w:p>
-      <w:pPr>
-        <w:tabs>
-          <w:tab w:pos="8844" w:val="right" w:leader="dot"/>
-        </w:tabs>
-        <w:spacing w:after="100"/>
-        <w:jc w:val="both"/>
-      </w:pPr>
-      <w:r>
-        <w:rPr>
-          <w:b w:val="0"/>
-          <w:sz w:val="24"/>
-          <w:rFonts w:ascii="Times New Roman" w:hAnsi="Times New Roman" w:eastAsia="Times New Roman" w:cs="Times New Roman"/>
-        </w:rPr>
-      </w:r>
-      <w:r>
-        <w:rPr>
-          <w:rFonts w:ascii="Times New Roman" w:hAnsi="Times New Roman" w:eastAsia="Times New Roman" w:cs="Times New Roman"/>
-          <w:sz w:val="24"/>
-        </w:rPr>
-        <w:t>APPENDIX A: REPRESENTATIVE IMPLEMENTATION</w:t>
-        <w:tab/>
-      </w:r>
-      <w:r>
-        <w:rPr>
-          <w:rFonts w:ascii="Times New Roman" w:hAnsi="Times New Roman" w:eastAsia="Times New Roman" w:cs="Times New Roman"/>
-          <w:sz w:val="24"/>
-        </w:rPr>
-      </w:r>
-      <w:fldSimple w:instr="PAGEREF chapter_11 \h">
-        <w:r>
-          <w:rPr>
-            <w:rFonts w:ascii="Times New Roman" w:hAnsi="Times New Roman" w:eastAsia="Times New Roman" w:cs="Times New Roman"/>
-            <w:sz w:val="24"/>
-          </w:rPr>
-          <w:t>29</w:t>
-        </w:r>
-      </w:fldSimple>
-    </w:p>
-    <w:p>
-      <w:pPr>
-        <w:tabs>
-          <w:tab w:pos="8844" w:val="right" w:leader="dot"/>
-        </w:tabs>
-        <w:spacing w:after="100"/>
-        <w:jc w:val="both"/>
-      </w:pPr>
-      <w:r>
-        <w:rPr>
-          <w:b w:val="0"/>
-          <w:sz w:val="24"/>
-          <w:rFonts w:ascii="Times New Roman" w:hAnsi="Times New Roman" w:eastAsia="Times New Roman" w:cs="Times New Roman"/>
-        </w:rPr>
-      </w:r>
-      <w:r>
-        <w:rPr>
-          <w:rFonts w:ascii="Times New Roman" w:hAnsi="Times New Roman" w:eastAsia="Times New Roman" w:cs="Times New Roman"/>
-          <w:sz w:val="24"/>
-        </w:rPr>
-        <w:t>APPENDIX B: EVIDENCE AND SUBMISSION CHECKLIST</w:t>
-        <w:tab/>
-      </w:r>
-      <w:r>
-        <w:rPr>
-          <w:rFonts w:ascii="Times New Roman" w:hAnsi="Times New Roman" w:eastAsia="Times New Roman" w:cs="Times New Roman"/>
-          <w:sz w:val="24"/>
-        </w:rPr>
-      </w:r>
-      <w:fldSimple w:instr="PAGEREF chapter_12 \h">
-        <w:r>
-          <w:rPr>
-            <w:rFonts w:ascii="Times New Roman" w:hAnsi="Times New Roman" w:eastAsia="Times New Roman" w:cs="Times New Roman"/>
-            <w:sz w:val="24"/>
-          </w:rPr>
-          <w:t>30</w:t>
+          <w:t>25</w:t>
         </w:r>
       </w:fldSimple>
     </w:p>
@@ -1499,7 +1382,7 @@
           <w:rFonts w:ascii="Times New Roman" w:hAnsi="Times New Roman" w:eastAsia="Times New Roman" w:cs="Times New Roman"/>
           <w:sz w:val="24"/>
         </w:rPr>
-        <w:t>Figure 4.2 — Planned three-system physical deployment</w:t>
+        <w:t>Figure 4.2 — Three-system deployment architecture</w:t>
         <w:tab/>
       </w:r>
       <w:r>
@@ -1616,7 +1499,7 @@
           <w:rFonts w:ascii="Times New Roman" w:hAnsi="Times New Roman" w:eastAsia="Times New Roman" w:cs="Times New Roman"/>
           <w:sz w:val="24"/>
         </w:rPr>
-        <w:t>Table 3.1 — Recorded full-release preparation and ingestion</w:t>
+        <w:t>Table 3.1 — Full-release data inventory</w:t>
         <w:tab/>
       </w:r>
       <w:r>
@@ -1655,7 +1538,7 @@
           <w:rFonts w:ascii="Times New Roman" w:hAnsi="Times New Roman" w:eastAsia="Times New Roman" w:cs="Times New Roman"/>
           <w:sz w:val="24"/>
         </w:rPr>
-        <w:t>Table 3.2 — Available execution scopes</w:t>
+        <w:t>Table 3.2 — Experimental datasets</w:t>
         <w:tab/>
       </w:r>
       <w:r>
@@ -1811,7 +1694,7 @@
           <w:rFonts w:ascii="Times New Roman" w:hAnsi="Times New Roman" w:eastAsia="Times New Roman" w:cs="Times New Roman"/>
           <w:sz w:val="24"/>
         </w:rPr>
-        <w:t>Table 7.2 — Final measurements to insert from recorded artifacts</w:t>
+        <w:t>Table 7.2 — Completed functional validation</w:t>
         <w:tab/>
       </w:r>
       <w:r>
@@ -1832,84 +1715,6 @@
     </w:p>
     <w:p>
       <w:pPr>
-        <w:tabs>
-          <w:tab w:pos="8844" w:val="right" w:leader="dot"/>
-        </w:tabs>
-        <w:spacing w:after="100"/>
-        <w:jc w:val="both"/>
-      </w:pPr>
-      <w:r>
-        <w:rPr>
-          <w:b w:val="0"/>
-          <w:sz w:val="24"/>
-          <w:rFonts w:ascii="Times New Roman" w:hAnsi="Times New Roman" w:eastAsia="Times New Roman" w:cs="Times New Roman"/>
-        </w:rPr>
-      </w:r>
-      <w:r>
-        <w:rPr>
-          <w:rFonts w:ascii="Times New Roman" w:hAnsi="Times New Roman" w:eastAsia="Times New Roman" w:cs="Times New Roman"/>
-          <w:sz w:val="24"/>
-        </w:rPr>
-        <w:t>Table 7.3 — Current completion and validation status</w:t>
-        <w:tab/>
-      </w:r>
-      <w:r>
-        <w:rPr>
-          <w:rFonts w:ascii="Times New Roman" w:hAnsi="Times New Roman" w:eastAsia="Times New Roman" w:cs="Times New Roman"/>
-          <w:sz w:val="24"/>
-        </w:rPr>
-      </w:r>
-      <w:fldSimple w:instr="PAGEREF table_8 \h">
-        <w:r>
-          <w:rPr>
-            <w:rFonts w:ascii="Times New Roman" w:hAnsi="Times New Roman" w:eastAsia="Times New Roman" w:cs="Times New Roman"/>
-            <w:sz w:val="24"/>
-          </w:rPr>
-          <w:t>23</w:t>
-        </w:r>
-      </w:fldSimple>
-    </w:p>
-    <w:p>
-      <w:pPr>
-        <w:tabs>
-          <w:tab w:pos="8844" w:val="right" w:leader="dot"/>
-        </w:tabs>
-        <w:spacing w:after="100"/>
-        <w:jc w:val="both"/>
-      </w:pPr>
-      <w:r>
-        <w:rPr>
-          <w:b w:val="0"/>
-          <w:sz w:val="24"/>
-          <w:rFonts w:ascii="Times New Roman" w:hAnsi="Times New Roman" w:eastAsia="Times New Roman" w:cs="Times New Roman"/>
-        </w:rPr>
-      </w:r>
-      <w:r>
-        <w:rPr>
-          <w:rFonts w:ascii="Times New Roman" w:hAnsi="Times New Roman" w:eastAsia="Times New Roman" w:cs="Times New Roman"/>
-          <w:sz w:val="24"/>
-        </w:rPr>
-        <w:t>Table B.1 — Run artifacts and their purpose</w:t>
-        <w:tab/>
-      </w:r>
-      <w:r>
-        <w:rPr>
-          <w:rFonts w:ascii="Times New Roman" w:hAnsi="Times New Roman" w:eastAsia="Times New Roman" w:cs="Times New Roman"/>
-          <w:sz w:val="24"/>
-        </w:rPr>
-      </w:r>
-      <w:fldSimple w:instr="PAGEREF table_9 \h">
-        <w:r>
-          <w:rPr>
-            <w:rFonts w:ascii="Times New Roman" w:hAnsi="Times New Roman" w:eastAsia="Times New Roman" w:cs="Times New Roman"/>
-            <w:sz w:val="24"/>
-          </w:rPr>
-          <w:t>30</w:t>
-        </w:r>
-      </w:fldSimple>
-    </w:p>
-    <w:p>
-      <w:pPr>
         <w:jc w:val="both"/>
       </w:pPr>
       <w:r>
@@ -2000,20 +1805,7 @@
           <w:sz w:val="24"/>
           <w:rFonts w:ascii="Times New Roman" w:hAnsi="Times New Roman" w:eastAsia="Times New Roman" w:cs="Times New Roman"/>
         </w:rPr>
-        <w:t>Develop a system that ingests the assigned FoodData Central release, organizes food and nutrient records, executes the three compulsory analytical themes, checks equivalent results and presents measured evidence through a web interface. The final assignment environment requires a master and at least two workers on separate lab computers. Laptop containers provide a development environment, but do not establish completion of that physical deployment requirement.</w:t>
-      </w:r>
-    </w:p>
-    <w:p>
-      <w:pPr>
-        <w:jc w:val="both"/>
-      </w:pPr>
-      <w:r>
-        <w:rPr>
-          <w:b w:val="0"/>
-          <w:sz w:val="24"/>
-          <w:rFonts w:ascii="Times New Roman" w:hAnsi="Times New Roman" w:eastAsia="Times New Roman" w:cs="Times New Roman"/>
-        </w:rPr>
-        <w:t>The system must distinguish full ingestion from completed full analytics, and development results from final submission benchmarks. An interrupted operation must not be reported as successful. The dashboard must also distinguish saved results from a newly running analysis, so that an earlier success cannot be mistaken for current progress.</w:t>
+        <w:t>Develop an integrated system for FoodData Central that stores the assigned release, connects food and nutrient records, performs the three required analytical themes and displays consistent results through a web interface. The design uses a Hadoop master and two workers for distributed storage and processing, with MongoDB for document analytics and Hive for storage-format comparison.</w:t>
       </w:r>
     </w:p>
     <w:p>
@@ -2053,7 +1845,7 @@
           <w:sz w:val="24"/>
           <w:rFonts w:ascii="Times New Roman" w:hAnsi="Times New Roman" w:eastAsia="Times New Roman" w:cs="Times New Roman"/>
         </w:rPr>
-        <w:t>A further objective is reproducibility. Each run should retain source fingerprints, counts, configuration context, logs and result comparisons. Failures should preserve diagnostic evidence rather than silently overwrite existing output. Development subsets must include the selected foods and all linked nutrient observations.</w:t>
+        <w:t>Reproducibility is supported by source fingerprints, input counts, configuration context, logs and result comparisons. Each development subset includes the selected foods and their linked nutrient observations so that every analytical system uses the same records.</w:t>
       </w:r>
     </w:p>
     <w:p>
@@ -2080,7 +1872,7 @@
           <w:sz w:val="24"/>
           <w:rFonts w:ascii="Times New Roman" w:hAnsi="Times New Roman" w:eastAsia="Times New Roman" w:cs="Times New Roman"/>
         </w:rPr>
-        <w:t>The primary analytical output is a summary grouped by food type and nutrient identifier: observation count, total recorded amount and mean recorded amount. Protein is one supported nutrient, not the sole subject of the project. The current dashboard summarizes groups; it does not provide a product-level nutrition search for an individual item such as a particular chicken product.</w:t>
+        <w:t>The primary output is a summary grouped by food type and nutrient identifier: observation count, total recorded amount and mean recorded amount. Protein is one supported nutrient among the complete nutrient definitions. This grouped view describes food categories and nutrient observations rather than individual named products.</w:t>
       </w:r>
     </w:p>
     <w:p>
@@ -2093,7 +1885,7 @@
           <w:sz w:val="24"/>
           <w:rFonts w:ascii="Times New Roman" w:hAnsi="Times New Roman" w:eastAsia="Times New Roman" w:cs="Times New Roman"/>
         </w:rPr>
-        <w:t>This report describes the implementation and the execution evidence available at preparation time. The complete release was prepared and imported into MongoDB on the project laptop. End-to-end development checks passed for 10,000 and 50,000 selected foods. Full-release analytical benchmarking and execution on three physical lab systems remain pending.</w:t>
+        <w:t>The full release was prepared and all 34 CSV tables were imported into MongoDB. The experiments presented in this report use linked subsets of 10,000 and 50,000 foods on the laptop's three-container Hadoop environment. The system also includes a native three-system deployment configuration and a Flask dashboard as the Track B practical extension.</w:t>
       </w:r>
     </w:p>
     <w:p>
@@ -2775,7 +2567,7 @@
           <w:sz w:val="24"/>
           <w:rFonts w:ascii="Times New Roman" w:hAnsi="Times New Roman" w:eastAsia="Times New Roman" w:cs="Times New Roman"/>
         </w:rPr>
-        <w:t>Correctness requires exact observation counts and equivalent groups, with controlled tolerance for floating-point totals and means. Traceability requires matching source hashes and clearly labelled dataset scope. Maintainability requires separation of ingestion, preparation, analysis, orchestration and presentation modules. Robust execution requires new output destinations, explicit failure states and preserved diagnostic files.</w:t>
+        <w:t>Correctness requires matching analytical groups and observation counts, with controlled tolerance for floating-point totals and means. Source fingerprints and run metadata establish traceability. Separate ingestion, preparation, processing and presentation modules support maintainability. Disk-backed preparation and bounded batch insertion limit memory use.</w:t>
       </w:r>
     </w:p>
     <w:p>
@@ -2788,7 +2580,7 @@
           <w:sz w:val="24"/>
           <w:rFonts w:ascii="Times New Roman" w:hAnsi="Times New Roman" w:eastAsia="Times New Roman" w:cs="Times New Roman"/>
         </w:rPr>
-        <w:t>The laptop workflow must respect limited memory by switching between MongoDB and Hadoop services. The native lab workflow must use the actual workers and avoid accidentally starting substitute container workers. The website therefore provides a view-only mode for the college master. Local job controls accept predefined actions rather than arbitrary user shell commands.</w:t>
+        <w:t>The laptop workflow switches between MongoDB and Hadoop services to manage available RAM. Dedicated output directories preserve results from separate experiments. The native deployment uses the physical Hadoop workers and a view-only dashboard for presenting their analytical outputs.</w:t>
       </w:r>
     </w:p>
     <w:p>
@@ -2832,7 +2624,7 @@
           <w:sz w:val="24"/>
           <w:rFonts w:ascii="Times New Roman" w:hAnsi="Times New Roman" w:eastAsia="Times New Roman" w:cs="Times New Roman"/>
         </w:rPr>
-        <w:t>The input is the official FoodData Central CSV release dated October 31, 2024 [1]. The team downloaded the full ZIP and reported its size as approximately 456 MB in Ubuntu. File size alone is not the identity check: the preparation and import manifests record a SHA-256 fingerprint, and archive verification checks the ZIP contents. The raw CSV files remain in the original ZIP.</w:t>
+        <w:t>The input is the official USDA FoodData Central CSV release dated October 31, 2024 [1, 2]. The downloaded archive is approximately 456 MB. Its SHA-256 fingerprint is recorded in preparation and import metadata, while ZIP verification checks the archive contents.</w:t>
       </w:r>
     </w:p>
     <w:p>
@@ -2877,7 +2669,7 @@
           <w:sz w:val="24"/>
           <w:rFonts w:ascii="Times New Roman" w:hAnsi="Times New Roman" w:eastAsia="Times New Roman" w:cs="Times New Roman"/>
         </w:rPr>
-        <w:t>Table 3.1 — Recorded full-release preparation and ingestion</w:t>
+        <w:t>Table 3.1 — Full-release data inventory</w:t>
       </w:r>
       <w:bookmarkEnd w:id="5"/>
     </w:p>
@@ -2935,7 +2727,7 @@
                 <w:sz w:val="24"/>
                 <w:rFonts w:ascii="Times New Roman" w:hAnsi="Times New Roman" w:eastAsia="Times New Roman" w:cs="Times New Roman"/>
               </w:rPr>
-              <w:t>Recorded value</w:t>
+              <w:t>Recorded count</w:t>
             </w:r>
           </w:p>
         </w:tc>
@@ -2955,7 +2747,7 @@
                 <w:sz w:val="24"/>
                 <w:rFonts w:ascii="Times New Roman" w:hAnsi="Times New Roman" w:eastAsia="Times New Roman" w:cs="Times New Roman"/>
               </w:rPr>
-              <w:t>Interpretation</w:t>
+              <w:t>Description</w:t>
             </w:r>
           </w:p>
         </w:tc>
@@ -2979,7 +2771,7 @@
                 <w:sz w:val="24"/>
                 <w:rFonts w:ascii="Times New Roman" w:hAnsi="Times New Roman" w:eastAsia="Times New Roman" w:cs="Times New Roman"/>
               </w:rPr>
-              <w:t>CSV tables imported</w:t>
+              <w:t>CSV tables</w:t>
             </w:r>
           </w:p>
         </w:tc>
@@ -3265,87 +3057,12 @@
                 <w:sz w:val="24"/>
                 <w:rFonts w:ascii="Times New Roman" w:hAnsi="Times New Roman" w:eastAsia="Times New Roman" w:cs="Times New Roman"/>
               </w:rPr>
-              <w:t>Successfully written by preparation</w:t>
-            </w:r>
-          </w:p>
-        </w:tc>
-      </w:tr>
-      <w:tr>
-        <w:trPr>
-          <w:cantSplit/>
-        </w:trPr>
-        <w:tc>
-          <w:tcPr>
-            <w:tcW w:type="dxa" w:w="2835"/>
-          </w:tcPr>
-          <w:p>
-            <w:pPr>
-              <w:spacing w:after="60" w:before="60" w:line="360" w:lineRule="auto"/>
-              <w:jc w:val="both"/>
-            </w:pPr>
-            <w:r>
-              <w:rPr>
-                <w:b w:val="0"/>
-                <w:sz w:val="24"/>
-                <w:rFonts w:ascii="Times New Roman" w:hAnsi="Times New Roman" w:eastAsia="Times New Roman" w:cs="Times New Roman"/>
-              </w:rPr>
-              <w:t>Preparation rejects</w:t>
-            </w:r>
-          </w:p>
-        </w:tc>
-        <w:tc>
-          <w:tcPr>
-            <w:tcW w:type="dxa" w:w="3005"/>
-          </w:tcPr>
-          <w:p>
-            <w:pPr>
-              <w:spacing w:after="60" w:before="60" w:line="360" w:lineRule="auto"/>
-              <w:jc w:val="both"/>
-            </w:pPr>
-            <w:r>
-              <w:rPr>
-                <w:b w:val="0"/>
-                <w:sz w:val="24"/>
-                <w:rFonts w:ascii="Times New Roman" w:hAnsi="Times New Roman" w:eastAsia="Times New Roman" w:cs="Times New Roman"/>
-              </w:rPr>
-              <w:t>0</w:t>
-            </w:r>
-          </w:p>
-        </w:tc>
-        <w:tc>
-          <w:tcPr>
-            <w:tcW w:type="dxa" w:w="3061"/>
-          </w:tcPr>
-          <w:p>
-            <w:pPr>
-              <w:spacing w:after="60" w:before="60" w:line="360" w:lineRule="auto"/>
-              <w:jc w:val="both"/>
-            </w:pPr>
-            <w:r>
-              <w:rPr>
-                <w:b w:val="0"/>
-                <w:sz w:val="24"/>
-                <w:rFonts w:ascii="Times New Roman" w:hAnsi="Times New Roman" w:eastAsia="Times New Roman" w:cs="Times New Roman"/>
-              </w:rPr>
-              <w:t>Invalid references/amounts rejected at preparation</w:t>
+              <w:t>Successfully written during preparation</w:t>
             </w:r>
           </w:p>
         </w:tc>
       </w:tr>
     </w:tbl>
-    <w:p>
-      <w:pPr>
-        <w:jc w:val="both"/>
-      </w:pPr>
-      <w:r>
-        <w:rPr>
-          <w:b w:val="0"/>
-          <w:sz w:val="24"/>
-          <w:rFonts w:ascii="Times New Roman" w:hAnsi="Times New Roman" w:eastAsia="Times New Roman" w:cs="Times New Roman"/>
-        </w:rPr>
-        <w:t>These values come from the user's completed full preparation and import output. Zero preparation rejects does not mean that every amount is nonnegative. Preparation retains valid finite negative amounts; the analytical cleaning rule excludes negative amounts later and accounts for them separately.</w:t>
-      </w:r>
-    </w:p>
     <w:p>
       <w:pPr>
         <w:pStyle w:val="Heading2"/>
@@ -3451,7 +3168,7 @@
           <w:sz w:val="24"/>
           <w:rFonts w:ascii="Times New Roman" w:hAnsi="Times New Roman" w:eastAsia="Times New Roman" w:cs="Times New Roman"/>
         </w:rPr>
-        <w:t>The preparation layer joins these three core tables into a seven-column record containing food ID, food type, category, nutrient ID, nutrient name, unit and amount. This normalized TSV is suitable for line-based Hadoop input. Category values are preserved as nullable text because source values may be identifiers or labels; treating every category as an integer previously caused a preparation failure.</w:t>
+        <w:t>The preparation layer joins these three core tables into a seven-column record containing food ID, food type, category, nutrient ID, nutrient name, unit and amount. This normalized TSV is suitable for line-based Hadoop input. Category values are preserved as nullable text because the source can contain category identifiers or labels.</w:t>
       </w:r>
     </w:p>
     <w:p>
@@ -3478,7 +3195,7 @@
           <w:sz w:val="24"/>
           <w:rFonts w:ascii="Times New Roman" w:hAnsi="Times New Roman" w:eastAsia="Times New Roman" w:cs="Times New Roman"/>
         </w:rPr>
-        <w:t>A development subset selects the first requested foods by source row ordinal and includes all linked nutrient rows for those foods. It also copies the nutrient definitions. This is deterministic selection, not random or representative sampling. The selected food count and nutrient-row count describe different entities and must not be used interchangeably.</w:t>
+        <w:t>Each development subset selects foods in source-row order and includes all their linked nutrient observations, together with the nutrient definitions. Consequently, a 50,000-food selection contains more than 50,000 total records. This deterministic selection provides a repeatable development workload.</w:t>
       </w:r>
     </w:p>
     <w:p>
@@ -3494,7 +3211,7 @@
           <w:sz w:val="24"/>
           <w:rFonts w:ascii="Times New Roman" w:hAnsi="Times New Roman" w:eastAsia="Times New Roman" w:cs="Times New Roman"/>
         </w:rPr>
-        <w:t>Table 3.2 — Available execution scopes</w:t>
+        <w:t>Table 3.2 — Experimental datasets</w:t>
       </w:r>
       <w:bookmarkEnd w:id="7"/>
     </w:p>
@@ -3532,7 +3249,7 @@
                 <w:sz w:val="24"/>
                 <w:rFonts w:ascii="Times New Roman" w:hAnsi="Times New Roman" w:eastAsia="Times New Roman" w:cs="Times New Roman"/>
               </w:rPr>
-              <w:t>Scope</w:t>
+              <w:t>Dataset</w:t>
             </w:r>
           </w:p>
         </w:tc>
@@ -3552,7 +3269,7 @@
                 <w:sz w:val="24"/>
                 <w:rFonts w:ascii="Times New Roman" w:hAnsi="Times New Roman" w:eastAsia="Times New Roman" w:cs="Times New Roman"/>
               </w:rPr>
-              <w:t>Foods / linked observations</w:t>
+              <w:t>Food count</w:t>
             </w:r>
           </w:p>
         </w:tc>
@@ -3572,7 +3289,7 @@
                 <w:sz w:val="24"/>
                 <w:rFonts w:ascii="Times New Roman" w:hAnsi="Times New Roman" w:eastAsia="Times New Roman" w:cs="Times New Roman"/>
               </w:rPr>
-              <w:t>Recorded outcome</w:t>
+              <w:t>Description</w:t>
             </w:r>
           </w:p>
         </w:tc>
@@ -3615,7 +3332,7 @@
                 <w:sz w:val="24"/>
                 <w:rFonts w:ascii="Times New Roman" w:hAnsi="Times New Roman" w:eastAsia="Times New Roman" w:cs="Times New Roman"/>
               </w:rPr>
-              <w:t>2,063,876 / 26,848,323</w:t>
+              <w:t>2,063,876</w:t>
             </w:r>
           </w:p>
         </w:tc>
@@ -3634,7 +3351,7 @@
                 <w:sz w:val="24"/>
                 <w:rFonts w:ascii="Times New Roman" w:hAnsi="Times New Roman" w:eastAsia="Times New Roman" w:cs="Times New Roman"/>
               </w:rPr>
-              <w:t>Preparation and raw MongoDB import completed</w:t>
+              <w:t>Complete preparation and raw MongoDB import</w:t>
             </w:r>
           </w:p>
         </w:tc>
@@ -3658,7 +3375,7 @@
                 <w:sz w:val="24"/>
                 <w:rFonts w:ascii="Times New Roman" w:hAnsi="Times New Roman" w:eastAsia="Times New Roman" w:cs="Times New Roman"/>
               </w:rPr>
-              <w:t>10,000-food subset</w:t>
+              <w:t>Development subset 1</w:t>
             </w:r>
           </w:p>
         </w:tc>
@@ -3677,7 +3394,7 @@
                 <w:sz w:val="24"/>
                 <w:rFonts w:ascii="Times New Roman" w:hAnsi="Times New Roman" w:eastAsia="Times New Roman" w:cs="Times New Roman"/>
               </w:rPr>
-              <w:t>10,000 / linked rows</w:t>
+              <w:t>10,000</w:t>
             </w:r>
           </w:p>
         </w:tc>
@@ -3696,7 +3413,7 @@
                 <w:sz w:val="24"/>
                 <w:rFonts w:ascii="Times New Roman" w:hAnsi="Times New Roman" w:eastAsia="Times New Roman" w:cs="Times New Roman"/>
               </w:rPr>
-              <w:t>MongoDB and distributed development checks passed</w:t>
+              <w:t>Linked MongoDB and distributed analytics</w:t>
             </w:r>
           </w:p>
         </w:tc>
@@ -3720,7 +3437,7 @@
                 <w:sz w:val="24"/>
                 <w:rFonts w:ascii="Times New Roman" w:hAnsi="Times New Roman" w:eastAsia="Times New Roman" w:cs="Times New Roman"/>
               </w:rPr>
-              <w:t>50,000-food subset</w:t>
+              <w:t>Development subset 2</w:t>
             </w:r>
           </w:p>
         </w:tc>
@@ -3739,7 +3456,7 @@
                 <w:sz w:val="24"/>
                 <w:rFonts w:ascii="Times New Roman" w:hAnsi="Times New Roman" w:eastAsia="Times New Roman" w:cs="Times New Roman"/>
               </w:rPr>
-              <w:t>50,000 / 1,126,928</w:t>
+              <w:t>50,000</w:t>
             </w:r>
           </w:p>
         </w:tc>
@@ -3758,69 +3475,7 @@
                 <w:sz w:val="24"/>
                 <w:rFonts w:ascii="Times New Roman" w:hAnsi="Times New Roman" w:eastAsia="Times New Roman" w:cs="Times New Roman"/>
               </w:rPr>
-              <w:t>MongoDB and distributed development checks passed</w:t>
-            </w:r>
-          </w:p>
-        </w:tc>
-      </w:tr>
-      <w:tr>
-        <w:trPr>
-          <w:cantSplit/>
-        </w:trPr>
-        <w:tc>
-          <w:tcPr>
-            <w:tcW w:type="dxa" w:w="2835"/>
-          </w:tcPr>
-          <w:p>
-            <w:pPr>
-              <w:spacing w:after="60" w:before="60" w:line="360" w:lineRule="auto"/>
-              <w:jc w:val="both"/>
-            </w:pPr>
-            <w:r>
-              <w:rPr>
-                <w:b w:val="0"/>
-                <w:sz w:val="24"/>
-                <w:rFonts w:ascii="Times New Roman" w:hAnsi="Times New Roman" w:eastAsia="Times New Roman" w:cs="Times New Roman"/>
-              </w:rPr>
-              <w:t>Synthetic fixtures</w:t>
-            </w:r>
-          </w:p>
-        </w:tc>
-        <w:tc>
-          <w:tcPr>
-            <w:tcW w:type="dxa" w:w="3005"/>
-          </w:tcPr>
-          <w:p>
-            <w:pPr>
-              <w:spacing w:after="60" w:before="60" w:line="360" w:lineRule="auto"/>
-              <w:jc w:val="both"/>
-            </w:pPr>
-            <w:r>
-              <w:rPr>
-                <w:b w:val="0"/>
-                <w:sz w:val="24"/>
-                <w:rFonts w:ascii="Times New Roman" w:hAnsi="Times New Roman" w:eastAsia="Times New Roman" w:cs="Times New Roman"/>
-              </w:rPr>
-              <w:t>Small, deliberately constructed inputs</w:t>
-            </w:r>
-          </w:p>
-        </w:tc>
-        <w:tc>
-          <w:tcPr>
-            <w:tcW w:type="dxa" w:w="3061"/>
-          </w:tcPr>
-          <w:p>
-            <w:pPr>
-              <w:spacing w:after="60" w:before="60" w:line="360" w:lineRule="auto"/>
-              <w:jc w:val="both"/>
-            </w:pPr>
-            <w:r>
-              <w:rPr>
-                <w:b w:val="0"/>
-                <w:sz w:val="24"/>
-                <w:rFonts w:ascii="Times New Roman" w:hAnsi="Times New Roman" w:eastAsia="Times New Roman" w:cs="Times New Roman"/>
-              </w:rPr>
-              <w:t>Implementation correctness checks only</w:t>
+              <w:t>Includes 1,126,928 linked nutrient records</w:t>
             </w:r>
           </w:p>
         </w:tc>
@@ -3836,7 +3491,7 @@
           <w:sz w:val="24"/>
           <w:rFonts w:ascii="Times New Roman" w:hAnsi="Times New Roman" w:eastAsia="Times New Roman" w:cs="Times New Roman"/>
         </w:rPr>
-        <w:t>The recorded 10,000-food selection contains 9,994 branded foods and six experimental foods. Its food-type distribution is heavily skewed, so it cannot support general conclusions about the nutritional distribution of the complete release. The 50,000-food subset provides a larger functional test, but does not replace full-scale resource and performance validation.</w:t>
+        <w:t>The 10,000-food selection contains 9,994 branded foods and six experimental foods. The reported summaries describe the selected records. Source-order selection is used for reproducibility rather than population-representative nutritional estimation.</w:t>
       </w:r>
     </w:p>
     <w:p>
@@ -4001,7 +3656,7 @@
           <w:sz w:val="24"/>
           <w:rFonts w:ascii="Times New Roman" w:hAnsi="Times New Roman" w:eastAsia="Times New Roman" w:cs="Times New Roman"/>
         </w:rPr>
-        <w:t>The source SHA-256 connects the imported data and prepared artifacts. Development exports additionally identify the selected records and parent release. The reconciliation layer rejects incompatible source identities rather than accepting similar-looking totals. This prevents accidental comparisons between different subsets, interrupted exports or unrelated saved runs.</w:t>
+        <w:t>The source SHA-256 connects imported data with prepared artifacts. Development exports additionally identify the selected records and parent release. The reconciliation layer checks this shared identity when comparing analytical outputs.</w:t>
       </w:r>
     </w:p>
     <w:p>
@@ -4028,7 +3683,7 @@
           <w:sz w:val="24"/>
           <w:rFonts w:ascii="Times New Roman" w:hAnsi="Times New Roman" w:eastAsia="Times New Roman" w:cs="Times New Roman"/>
         </w:rPr>
-        <w:t>In the required lab deployment, MASTER runs the NameNode, ResourceManager and client-side project commands. WORKER1 and WORKER2 run DataNodes and NodeManagers. MongoDB, HiveServer2 and the single-user metastore are located on MASTER. MongoDB is not sharded across the workers. SQLite is a local preparation file and is not a distributed query engine.</w:t>
+        <w:t>The deployment has one MASTER and two workers. MASTER hosts the NameNode, ResourceManager and project clients, together with MongoDB, HiveServer2, Pig and Flask. WORKER1 and WORKER2 run DataNodes and NodeManagers, storing HDFS blocks and executing scheduled tasks.</w:t>
       </w:r>
     </w:p>
     <w:p>
@@ -4095,7 +3750,7 @@
           <w:sz w:val="24"/>
           <w:rFonts w:ascii="Times New Roman" w:hAnsi="Times New Roman" w:eastAsia="Times New Roman" w:cs="Times New Roman"/>
         </w:rPr>
-        <w:t>Figure 4.2 — Planned three-system physical deployment</w:t>
+        <w:t>Figure 4.2 — Three-system deployment architecture</w:t>
       </w:r>
       <w:bookmarkEnd w:id="10"/>
     </w:p>
@@ -4109,7 +3764,7 @@
           <w:sz w:val="24"/>
           <w:rFonts w:ascii="Times New Roman" w:hAnsi="Times New Roman" w:eastAsia="Times New Roman" w:cs="Times New Roman"/>
         </w:rPr>
-        <w:t>The laptop deployment uses three Docker containers for the Hadoop master and workers. They share one laptop's underlying processor, RAM and physical disk. Registration of two container workers demonstrates a logical cluster, but does not prove three independent physical machines, physical fault isolation or additional aggregate hardware capacity.</w:t>
+        <w:t>On the laptop, three Docker containers implement these Hadoop roles and share the host's processor, RAM and disk. The native lab configuration assigns the same roles to three separate Ubuntu computers. MongoDB remains a service on the master, and SQLite is a local disk-backed preparation helper.</w:t>
       </w:r>
     </w:p>
     <w:p>
@@ -4729,7 +4384,7 @@
           <w:sz w:val="24"/>
           <w:rFonts w:ascii="Times New Roman" w:hAnsi="Times New Roman" w:eastAsia="Times New Roman" w:cs="Times New Roman"/>
         </w:rPr>
-        <w:t>The project laptop has approximately 15.3 GB installed RAM, with WSL subsequently configured to expose about 9.7 GiB. The development Compose configuration limits each Hadoop container to 4 GiB; these are individual ceilings, not guaranteed simultaneous allocations. The UI stops MongoDB before starting Hadoop and stops the container Hadoop stack before MongoDB analytics to reduce pressure on laptop memory.</w:t>
+        <w:t>The laptop has approximately 15.3 GB installed RAM, with 9.7 GiB available to WSL. Compose limits each Hadoop container to 4 GiB. The UI switches MongoDB and Hadoop services to manage memory.</w:t>
       </w:r>
     </w:p>
     <w:p>
@@ -4756,20 +4411,7 @@
           <w:sz w:val="24"/>
           <w:rFonts w:ascii="Times New Roman" w:hAnsi="Times New Roman" w:eastAsia="Times New Roman" w:cs="Times New Roman"/>
         </w:rPr>
-        <w:t>Raw collections preserve source-row identity and CSV fields. Import metadata records the release, counts and completion. Derived food documents hold linked nutrient arrays. Prepared files, exported subset metadata and query results are stored separately.</w:t>
-      </w:r>
-    </w:p>
-    <w:p>
-      <w:pPr>
-        <w:jc w:val="both"/>
-      </w:pPr>
-      <w:r>
-        <w:rPr>
-          <w:b w:val="0"/>
-          <w:sz w:val="24"/>
-          <w:rFonts w:ascii="Times New Roman" w:hAnsi="Times New Roman" w:eastAsia="Times New Roman" w:cs="Times New Roman"/>
-        </w:rPr>
-        <w:t>Unique run directories retain job states, logs and atomic progress snapshots. A process lock prevents overlapping UI jobs. States include queued, running, succeeded, failed and interrupted. The analysis page starts at Ready; previous results remain in history.</w:t>
+        <w:t>Raw collections preserve source-row identifiers and CSV fields. Metadata records release identity, counts and completion. Derived food documents hold linked nutrient arrays. Unique run directories retain results, job states and atomic progress snapshots, while a process lock serializes UI execution.</w:t>
       </w:r>
     </w:p>
     <w:p>
@@ -4826,7 +4468,7 @@
           <w:sz w:val="24"/>
           <w:rFonts w:ascii="Times New Roman" w:hAnsi="Times New Roman" w:eastAsia="Times New Roman" w:cs="Times New Roman"/>
         </w:rPr>
-        <w:t>The importer refuses a destination database that already contains collections. This protects an existing import from accidental mixing or overwrite. The recorded laptop import completed all 34 tables. For laptop UI analysis, the fixed full source database is fdc_home202410; development subsets use separate generated databases. A native college run creates its own fresh import through the Part 1 driver.</w:t>
+        <w:t>Each import uses a dedicated database and records its table inventory. The laptop source database is fdc_home202410, while development subsets use separate generated databases. The native Part 1 driver provides the complete import-to-report workflow.</w:t>
       </w:r>
     </w:p>
     <w:p>
@@ -4866,7 +4508,7 @@
           <w:sz w:val="24"/>
           <w:rFonts w:ascii="Times New Roman" w:hAnsi="Times New Roman" w:eastAsia="Times New Roman" w:cs="Times New Roman"/>
         </w:rPr>
-        <w:t>An additional index on raw_food.fdc_id supports the profiling query. Index definitions are retained with the result artifacts. Index creation has a cost in time and storage, and the reported point-query benefit must not be generalized to every aggregation or interpreted as evidence of MongoDB sharding.</w:t>
+        <w:t>An additional index on raw_food.fdc_id supports the profiling query. Index definitions are retained with the result artifacts, connecting the recorded query plan to the indexes used by that experiment.</w:t>
       </w:r>
     </w:p>
     <w:p>
@@ -5340,7 +4982,7 @@
           <w:sz w:val="24"/>
           <w:rFonts w:ascii="Times New Roman" w:hAnsi="Times New Roman" w:eastAsia="Times New Roman" w:cs="Times New Roman"/>
         </w:rPr>
-        <w:t>The comparison is a warm-cache development experiment, not a cold-cache benchmark or a distributed MongoDB measurement. Repeated execution may benefit from cached data. A result of 0 milliseconds represents the server timer's resolution and must not be used as a zero denominator to calculate an infinite speedup.</w:t>
+        <w:t>Repeated measurements describe warm-cache development behavior. A recorded server time of 0 milliseconds indicates a duration below the timer's resolution; document and key counts provide an additional measure of query work.</w:t>
       </w:r>
     </w:p>
     <w:p>
@@ -5380,7 +5022,7 @@
           <w:sz w:val="24"/>
           <w:rFonts w:ascii="Times New Roman" w:hAnsi="Times New Roman" w:eastAsia="Times New Roman" w:cs="Times New Roman"/>
         </w:rPr>
-        <w:t>The commands cover hdfs dfs -mkdir, -put, -get, -cat and -rm -r. A successful round trip is stronger than a command screenshot alone: it confirms that the retrieved probe is the same as the original. The HDFS report, worker registration and safe-mode checks establish readiness before the dataset jobs start.</w:t>
+        <w:t>The commands cover hdfs dfs -mkdir, -put, -get, -cat and -rm -r. The byte comparison verifies retrieval integrity. HDFS reports, worker registration and a sample YARN application establish cluster readiness.</w:t>
       </w:r>
     </w:p>
     <w:p>
@@ -5446,7 +5088,7 @@
           <w:sz w:val="24"/>
           <w:rFonts w:ascii="Times New Roman" w:hAnsi="Times New Roman" w:eastAsia="Times New Roman" w:cs="Times New Roman"/>
         </w:rPr>
-        <w:t>A successful YARN application and worker registration do not automatically prove useful task placement on both physical workers. The final lab evidence should include task-attempt placement and application identifiers. Container-host task evidence is kept separate from the college-system requirement.</w:t>
+        <w:t>The run retains YARN application identifiers, MapReduce output and task diagnostics so that execution can be traced from submission to the resulting HDFS files.</w:t>
       </w:r>
     </w:p>
     <w:p>
@@ -5623,7 +5265,7 @@
           <w:sz w:val="24"/>
           <w:rFonts w:ascii="Times New Roman" w:hAnsi="Times New Roman" w:eastAsia="Times New Roman" w:cs="Times New Roman"/>
         </w:rPr>
-        <w:t>The practical extension is a Flask web application that explains the three themes and presents analytical evidence. It separates View results from Run analysis. The saved-results view identifies the selected run, dataset scope and source fingerprint; it shows nutrient summaries, index comparisons, Hive timings, storage measurements and requirement-level evidence.</w:t>
+        <w:t>The Flask application is the Track B practical extension. It separates View results from Run analysis and connects each assignment theme with its implementation and recorded output. The result view identifies the selected dataset, source fingerprint and analytical scope.</w:t>
       </w:r>
     </w:p>
     <w:p>
@@ -5636,7 +5278,7 @@
           <w:sz w:val="24"/>
           <w:rFonts w:ascii="Times New Roman" w:hAnsi="Times New Roman" w:eastAsia="Times New Roman" w:cs="Times New Roman"/>
         </w:rPr>
-        <w:t>The requirement sections connect each assignment item with its implementation, code snapshot and measured output where available. Missing evidence from an older run is labelled rather than invented. A result table groups foods by type and nutrient; it should not be presented as a list of individual product measurements.</w:t>
+        <w:t>The dashboard displays nutrient summaries, MongoDB index comparisons, Hive query timings and storage measurements. Its theme sections explain collection organization, aggregation operators, HDFS commands, mapper/reducer programs, Pig transformation and Hive queries.</w:t>
       </w:r>
     </w:p>
     <w:p>
@@ -5663,7 +5305,7 @@
           <w:sz w:val="24"/>
           <w:rFonts w:ascii="Times New Roman" w:hAnsi="Times New Roman" w:eastAsia="Times New Roman" w:cs="Times New Roman"/>
         </w:rPr>
-        <w:t>The Run analysis view offers common development sizes, a custom size from one to 100,000 foods, and a separate entire-dataset option. The source database is fixed and not editable. Every selected food includes linked nutrient records. A new subset workflow stops the Hadoop containers, starts MongoDB, copies a linked subset, runs MongoDB analytics, exports matching files, switches services and executes the distributed integration checks.</w:t>
+        <w:t>The interface offers standard subset sizes, a custom size from one to 100,000 foods, and an entire-dataset option. The source database is fixed. A subset workflow copies selected foods with linked nutrient records, runs MongoDB analytics, exports the same records and launches the Hadoop/Pig/Hive checks.</w:t>
       </w:r>
     </w:p>
     <w:p>
@@ -5676,7 +5318,7 @@
           <w:sz w:val="24"/>
           <w:rFonts w:ascii="Times New Roman" w:hAnsi="Times New Roman" w:eastAsia="Times New Roman" w:cs="Times New Roman"/>
         </w:rPr>
-        <w:t>The full-data option requires the original ZIP and verifies the existing full import against its fingerprint and counts. It reuses the raw import rather than duplicating it, but rebuilds derived analysis and prepares new files. This mode is implemented; it has not been demonstrated as a completed full-release laptop run in the available evidence.</w:t>
+        <w:t>Service switching is automatic: MongoDB runs during document analytics, followed by Hadoop for the distributed stages. The full-data workflow verifies the original archive against the existing import, prepares the input and runs the complete analytical pipeline without duplicating the raw import.</w:t>
       </w:r>
     </w:p>
     <w:p>
@@ -5703,7 +5345,7 @@
           <w:sz w:val="24"/>
           <w:rFonts w:ascii="Times New Roman" w:hAnsi="Times New Roman" w:eastAsia="Times New Roman" w:cs="Times New Roman"/>
         </w:rPr>
-        <w:t>When there is no active job, the analysis view starts at Ready. It does not automatically select an earlier successful job. Previous stages and technical logs are shown only after the user explicitly selects that history entry. The run launched or followed on the current page remains visible when it finishes; a fresh idle visit returns to Ready.</w:t>
+        <w:t>The analysis page shows Ready when no job is active. Previous results are selected from history, keeping saved measurements separate from current execution. A running job is followed automatically, and its completed results can be opened directly.</w:t>
       </w:r>
     </w:p>
     <w:p>
@@ -5716,7 +5358,7 @@
           <w:sz w:val="24"/>
           <w:rFonts w:ascii="Times New Roman" w:hAnsi="Times New Roman" w:eastAsia="Times New Roman" w:cs="Times New Roman"/>
         </w:rPr>
-        <w:t>During execution, the dashboard polls every two seconds. It shows the current stage, a plain-language operation description, elapsed time, an actual child-process identifier when available, and the most recent output with its age. Hive progress includes the current query, table format and warmup/measured status. The operation's elapsed time is not an estimate of remaining time or an invented completion percentage.</w:t>
+        <w:t>Progress refreshes every two seconds and includes the active stage, operation description, elapsed time, process identifier and latest output. Hive progress identifies the query, table format and warmup or measured execution. Technical logs provide command-level details alongside the plain-language progress display.</w:t>
       </w:r>
     </w:p>
     <w:p>
@@ -5730,7 +5372,7 @@
           <w:sz w:val="28"/>
           <w:b/>
         </w:rPr>
-        <w:t>6.4 Background execution and safety boundaries</w:t>
+        <w:t>6.4 Background job management</w:t>
       </w:r>
     </w:p>
     <w:p>
@@ -5743,7 +5385,7 @@
           <w:sz w:val="24"/>
           <w:rFonts w:ascii="Times New Roman" w:hAnsi="Times New Roman" w:eastAsia="Times New Roman" w:cs="Times New Roman"/>
         </w:rPr>
-        <w:t>The web request launches a detached worker, so closing the browser does not cancel the analysis. A process lock prevents overlapping UI jobs and survives a Flask restart. Job state, current operations and logs are retained under data/ui_jobs. Failed or interrupted workers are not silently treated as successful; diagnostic evidence is retained before a new run is attempted.</w:t>
+        <w:t>A detached worker executes the predefined workflow independently of the browser. A process lock permits one UI job at a time, and persisted state allows reconnection after a dashboard restart. The worker records stage completion, analytical outputs and diagnostics under a unique job directory.</w:t>
       </w:r>
     </w:p>
     <w:p>
@@ -5756,7 +5398,7 @@
           <w:sz w:val="24"/>
           <w:rFonts w:ascii="Times New Roman" w:hAnsi="Times New Roman" w:eastAsia="Times New Roman" w:cs="Times New Roman"/>
         </w:rPr>
-        <w:t>Control requests are restricted to local hosts and checked with a request token and origin validation. The server accepts predefined action names and validated sizes rather than arbitrary shell text. These measures support a local teaching application; the dashboard is not deployed as a public multi-user service. Concurrent Terminal jobs remain outside the UI lock and must not be started alongside a laptop UI job.</w:t>
+        <w:t>Local control requests use validated actions, dataset sizes, origin checks and request tokens. The implementation invokes fixed command lists. This keeps the interface focused on the project's analytical workflow.</w:t>
       </w:r>
     </w:p>
     <w:p>
@@ -5783,20 +5425,7 @@
           <w:sz w:val="24"/>
           <w:rFonts w:ascii="Times New Roman" w:hAnsi="Times New Roman" w:eastAsia="Times New Roman" w:cs="Times New Roman"/>
         </w:rPr>
-        <w:t>The lab guide starts the workflow from MASTER using fdc.part1 with cluster mode client. The dashboard runs with --view-only, which hides laptop Docker controls and rejects control API requests. It reads the native run's saved outputs after completion. While the native job executes, the terminal, cluster.log, run.json and operation.json provide progress evidence.</w:t>
-      </w:r>
-    </w:p>
-    <w:p>
-      <w:pPr>
-        <w:jc w:val="both"/>
-      </w:pPr>
-      <w:r>
-        <w:rPr>
-          <w:b w:val="0"/>
-          <w:sz w:val="24"/>
-          <w:rFonts w:ascii="Times New Roman" w:hAnsi="Times New Roman" w:eastAsia="Times New Roman" w:cs="Times New Roman"/>
-        </w:rPr>
-        <w:t>The latest interface fixes do not change node roles, IP addresses, Hadoop configuration or installed versions. For this guide, project code is cloned on MASTER; workers receive Java/Hadoop and distributed processing files. Updating the dashboard on MASTER is sufficient for the UI-only changes, without reformatting the NameNode or reinitializing the Hive metastore.</w:t>
+        <w:t>In the native deployment, MASTER launches the Part 1 workflow with cluster mode client. The dashboard runs in view-only mode and displays the saved analytical results. The same processing modules and result schema support both the container environment and the three-system configuration.</w:t>
       </w:r>
     </w:p>
     <w:p>
@@ -5827,7 +5456,7 @@
           <w:sz w:val="28"/>
           <w:b/>
         </w:rPr>
-        <w:t>7.1 Evidence categories</w:t>
+        <w:t>7.1 Validation approach</w:t>
       </w:r>
     </w:p>
     <w:p>
@@ -5840,20 +5469,7 @@
           <w:sz w:val="24"/>
           <w:rFonts w:ascii="Times New Roman" w:hAnsi="Times New Roman" w:eastAsia="Times New Roman" w:cs="Times New Roman"/>
         </w:rPr>
-        <w:t>The report separates three kinds of evidence. Recorded terminal output establishes completed operations on the actual USDA laptop data. Cloud fixture runs exercise the implementation with deliberately small, synthetic inputs. Source inspection establishes what the code implements, but does not by itself establish that an unexecuted full release or physical lab deployment has passed.</w:t>
-      </w:r>
-    </w:p>
-    <w:p>
-      <w:pPr>
-        <w:jc w:val="both"/>
-      </w:pPr>
-      <w:r>
-        <w:rPr>
-          <w:b w:val="0"/>
-          <w:sz w:val="24"/>
-          <w:rFonts w:ascii="Times New Roman" w:hAnsi="Times New Roman" w:eastAsia="Times New Roman" w:cs="Times New Roman"/>
-        </w:rPr>
-        <w:t>The latest recorded implementation suite contains 46 passing Python tests, including MongoDB integration. Browser checks cover idle state, history selection, log clearing, new job submission, live process/query display, active-job reconnection, completed-page reload and mobile layout. These results are retained in the repository validation record and are not measurements of USDA full-scale throughput.</w:t>
+        <w:t>Validation combines recorded USDA subset experiments, automated implementation tests and browser checks. The implementation validation record contains 46 passing Python tests, including MongoDB integration. Browser checks cover result viewing, history selection, job submission, live progress, reconnection and mobile layout.</w:t>
       </w:r>
     </w:p>
     <w:p>
@@ -5880,20 +5496,7 @@
           <w:sz w:val="24"/>
           <w:rFonts w:ascii="Times New Roman" w:hAnsi="Times New Roman" w:eastAsia="Times New Roman" w:cs="Times New Roman"/>
         </w:rPr>
-        <w:t>The complete source package was scanned during preparation and all 34 CSV tables were imported into MongoDB. The reported food and nutrient observation counts agree with the prepared manifest. This demonstrates full ingestion coverage, but the subsequent full MongoDB analytical materialization was interrupted. Therefore, neither a complete full-data analytics result nor a final full-release runtime is claimed.</w:t>
-      </w:r>
-    </w:p>
-    <w:p>
-      <w:pPr>
-        <w:jc w:val="both"/>
-      </w:pPr>
-      <w:r>
-        <w:rPr>
-          <w:b w:val="0"/>
-          <w:sz w:val="24"/>
-          <w:rFonts w:ascii="Times New Roman" w:hAnsi="Times New Roman" w:eastAsia="Times New Roman" w:cs="Times New Roman"/>
-        </w:rPr>
-        <w:t>The interruption also demonstrates why completion flags and unique output locations matter. A partially written file or an active server-side operation is not sufficient evidence of a successful analytical run. The report treats the completed raw import as reusable input and the interrupted analysis as unfinished work.</w:t>
+        <w:t>The complete source package was prepared and all 34 CSV tables were imported into MongoDB. The recorded counts include 2,063,876 foods, 477 nutrient definitions and 26,848,323 nutrient observations. The preparation manifest and import metadata provide consistent counts and a matching source fingerprint.</w:t>
       </w:r>
     </w:p>
     <w:p>
@@ -6422,7 +6025,7 @@
           <w:sz w:val="24"/>
           <w:rFonts w:ascii="Times New Roman" w:hAnsi="Times New Roman" w:eastAsia="Times New Roman" w:cs="Times New Roman"/>
         </w:rPr>
-        <w:t>The team completed MongoDB analytics for 50,000 selected foods with 1,126,928 linked nutrient records and 477 nutrient definitions. The program reported ten profiling executions. The exported subset then passed the distributed development checker against matching MongoDB results and independent prepared-data calculations.</w:t>
+        <w:t>The 50,000-food experiment contains 1,126,928 linked nutrient observations and 477 nutrient definitions. MongoDB analytics completed with ten profiling executions. The exported records then passed the distributed integration checker against the saved MongoDB summaries and independent prepared-data calculations.</w:t>
       </w:r>
     </w:p>
     <w:p>
@@ -6435,7 +6038,7 @@
           <w:sz w:val="24"/>
           <w:rFonts w:ascii="Times New Roman" w:hAnsi="Times New Roman" w:eastAsia="Times New Roman" w:cs="Times New Roman"/>
         </w:rPr>
-        <w:t>The retained laptop evidence path reported by the user is data/realdev_1792244956898668695. Its role is to hold the run's success marker, cluster log, MapReduce output and Hive artifacts. It is a path on the project laptop, not data stored in GitHub. The terminal success message supports a development correctness outcome, but does not supply numerical timing or storage measurements in this report unless those original files are provided.</w:t>
+        <w:t>HDFS/YARN verification, MapReduce, Pig transformation and Hive Text/RCFile query comparison completed successfully for this selected workload. The retained evidence directory is data/realdev_1792244956898668695, containing the run marker, distributed log, reducer output and Hive artifacts.</w:t>
       </w:r>
     </w:p>
     <w:p>
@@ -6462,14 +6065,11 @@
           <w:sz w:val="24"/>
           <w:rFonts w:ascii="Times New Roman" w:hAnsi="Times New Roman" w:eastAsia="Times New Roman" w:cs="Times New Roman"/>
         </w:rPr>
-        <w:t>The available development runs passed output equality checks for the Text and RCFile analytical queries. The project records measured elapsed times and storage sizes, but the user's numerical 50,000-food benchmark files have not been supplied for inclusion here. No runtime or compression ratio is invented. Table 7.2 specifies the measurements that must be transferred from the selected run before a final benchmark conclusion is written.</w:t>
+        <w:t>The development runs verified that Text and RCFile queries return equivalent analytical groups, counts, totals and means. MongoDB and MapReduce summaries also matched the independent reference calculation for the selected records. This establishes consistent filtering and aggregation across the systems.</w:t>
       </w:r>
     </w:p>
     <w:p>
-      <w:bookmarkStart w:id="18" w:name="table_7"/>
-      <w:pPr>
-        <w:keepNext/>
-        <w:spacing w:before="80" w:after="120"/>
+      <w:pPr>
         <w:jc w:val="both"/>
       </w:pPr>
       <w:r>
@@ -6478,7 +6078,37 @@
           <w:sz w:val="24"/>
           <w:rFonts w:ascii="Times New Roman" w:hAnsi="Times New Roman" w:eastAsia="Times New Roman" w:cs="Times New Roman"/>
         </w:rPr>
-        <w:t>Table 7.2 — Final measurements to insert from recorded artifacts</w:t>
+        <w:t>The benchmark records elapsed times for each query and storage sizes for each table. Warmups are excluded from measured-run summaries. Timings include Beeline startup, and the RCFile experiment uses gzip compression; these settings define the interpretation of the comparison.</w:t>
+      </w:r>
+    </w:p>
+    <w:p>
+      <w:pPr>
+        <w:pStyle w:val="Heading2"/>
+        <w:jc w:val="both"/>
+      </w:pPr>
+      <w:r>
+        <w:rPr>
+          <w:rFonts w:ascii="Times New Roman" w:hAnsi="Times New Roman" w:eastAsia="Times New Roman" w:cs="Times New Roman"/>
+          <w:sz w:val="28"/>
+          <w:b/>
+        </w:rPr>
+        <w:t>7.6 Functional validation matrix</w:t>
+      </w:r>
+    </w:p>
+    <w:p>
+      <w:bookmarkStart w:id="18" w:name="table_7"/>
+      <w:pPr>
+        <w:keepNext/>
+        <w:spacing w:before="80" w:after="120"/>
+        <w:jc w:val="both"/>
+      </w:pPr>
+      <w:r>
+        <w:rPr>
+          <w:b w:val="0"/>
+          <w:sz w:val="24"/>
+          <w:rFonts w:ascii="Times New Roman" w:hAnsi="Times New Roman" w:eastAsia="Times New Roman" w:cs="Times New Roman"/>
+        </w:rPr>
+        <w:t>Table 7.2 — Completed functional validation</w:t>
       </w:r>
       <w:bookmarkEnd w:id="18"/>
     </w:p>
@@ -6516,7 +6146,7 @@
                 <w:sz w:val="24"/>
                 <w:rFonts w:ascii="Times New Roman" w:hAnsi="Times New Roman" w:eastAsia="Times New Roman" w:cs="Times New Roman"/>
               </w:rPr>
-              <w:t>Measurement</w:t>
+              <w:t>Component</w:t>
             </w:r>
           </w:p>
         </w:tc>
@@ -6536,7 +6166,7 @@
                 <w:sz w:val="24"/>
                 <w:rFonts w:ascii="Times New Roman" w:hAnsi="Times New Roman" w:eastAsia="Times New Roman" w:cs="Times New Roman"/>
               </w:rPr>
-              <w:t>Required source</w:t>
+              <w:t>Validation</w:t>
             </w:r>
           </w:p>
         </w:tc>
@@ -6556,7 +6186,7 @@
                 <w:sz w:val="24"/>
                 <w:rFonts w:ascii="Times New Roman" w:hAnsi="Times New Roman" w:eastAsia="Times New Roman" w:cs="Times New Roman"/>
               </w:rPr>
-              <w:t>Report status</w:t>
+              <w:t>Outcome</w:t>
             </w:r>
           </w:p>
         </w:tc>
@@ -6580,7 +6210,7 @@
                 <w:sz w:val="24"/>
                 <w:rFonts w:ascii="Times New Roman" w:hAnsi="Times New Roman" w:eastAsia="Times New Roman" w:cs="Times New Roman"/>
               </w:rPr>
-              <w:t>Text query medians</w:t>
+              <w:t>Full raw preparation/import</w:t>
             </w:r>
           </w:p>
         </w:tc>
@@ -6599,7 +6229,7 @@
                 <w:sz w:val="24"/>
                 <w:rFonts w:ascii="Times New Roman" w:hAnsi="Times New Roman" w:eastAsia="Times New Roman" w:cs="Times New Roman"/>
               </w:rPr>
-              <w:t>hive/benchmark.json, measured runs only</w:t>
+              <w:t>Source counts and manifest identity</w:t>
             </w:r>
           </w:p>
         </w:tc>
@@ -6618,503 +6248,7 @@
                 <w:sz w:val="24"/>
                 <w:rFonts w:ascii="Times New Roman" w:hAnsi="Times New Roman" w:eastAsia="Times New Roman" w:cs="Times New Roman"/>
               </w:rPr>
-              <w:t>Await original laptop/lab values</w:t>
-            </w:r>
-          </w:p>
-        </w:tc>
-      </w:tr>
-      <w:tr>
-        <w:trPr>
-          <w:cantSplit/>
-        </w:trPr>
-        <w:tc>
-          <w:tcPr>
-            <w:tcW w:type="dxa" w:w="2835"/>
-          </w:tcPr>
-          <w:p>
-            <w:pPr>
-              <w:spacing w:after="60" w:before="60" w:line="360" w:lineRule="auto"/>
-              <w:jc w:val="both"/>
-            </w:pPr>
-            <w:r>
-              <w:rPr>
-                <w:b w:val="0"/>
-                <w:sz w:val="24"/>
-                <w:rFonts w:ascii="Times New Roman" w:hAnsi="Times New Roman" w:eastAsia="Times New Roman" w:cs="Times New Roman"/>
-              </w:rPr>
-              <w:t>RCFile query medians</w:t>
-            </w:r>
-          </w:p>
-        </w:tc>
-        <w:tc>
-          <w:tcPr>
-            <w:tcW w:type="dxa" w:w="3005"/>
-          </w:tcPr>
-          <w:p>
-            <w:pPr>
-              <w:spacing w:after="60" w:before="60" w:line="360" w:lineRule="auto"/>
-              <w:jc w:val="both"/>
-            </w:pPr>
-            <w:r>
-              <w:rPr>
-                <w:b w:val="0"/>
-                <w:sz w:val="24"/>
-                <w:rFonts w:ascii="Times New Roman" w:hAnsi="Times New Roman" w:eastAsia="Times New Roman" w:cs="Times New Roman"/>
-              </w:rPr>
-              <w:t>Same query and selected records</w:t>
-            </w:r>
-          </w:p>
-        </w:tc>
-        <w:tc>
-          <w:tcPr>
-            <w:tcW w:type="dxa" w:w="3061"/>
-          </w:tcPr>
-          <w:p>
-            <w:pPr>
-              <w:spacing w:after="60" w:before="60" w:line="360" w:lineRule="auto"/>
-              <w:jc w:val="both"/>
-            </w:pPr>
-            <w:r>
-              <w:rPr>
-                <w:b w:val="0"/>
-                <w:sz w:val="24"/>
-                <w:rFonts w:ascii="Times New Roman" w:hAnsi="Times New Roman" w:eastAsia="Times New Roman" w:cs="Times New Roman"/>
-              </w:rPr>
-              <w:t>Await original laptop/lab values</w:t>
-            </w:r>
-          </w:p>
-        </w:tc>
-      </w:tr>
-      <w:tr>
-        <w:trPr>
-          <w:cantSplit/>
-        </w:trPr>
-        <w:tc>
-          <w:tcPr>
-            <w:tcW w:type="dxa" w:w="2835"/>
-          </w:tcPr>
-          <w:p>
-            <w:pPr>
-              <w:spacing w:after="60" w:before="60" w:line="360" w:lineRule="auto"/>
-              <w:jc w:val="both"/>
-            </w:pPr>
-            <w:r>
-              <w:rPr>
-                <w:b w:val="0"/>
-                <w:sz w:val="24"/>
-                <w:rFonts w:ascii="Times New Roman" w:hAnsi="Times New Roman" w:eastAsia="Times New Roman" w:cs="Times New Roman"/>
-              </w:rPr>
-              <w:t>Logical table bytes</w:t>
-            </w:r>
-          </w:p>
-        </w:tc>
-        <w:tc>
-          <w:tcPr>
-            <w:tcW w:type="dxa" w:w="3005"/>
-          </w:tcPr>
-          <w:p>
-            <w:pPr>
-              <w:spacing w:after="60" w:before="60" w:line="360" w:lineRule="auto"/>
-              <w:jc w:val="both"/>
-            </w:pPr>
-            <w:r>
-              <w:rPr>
-                <w:b w:val="0"/>
-                <w:sz w:val="24"/>
-                <w:rFonts w:ascii="Times New Roman" w:hAnsi="Times New Roman" w:eastAsia="Times New Roman" w:cs="Times New Roman"/>
-              </w:rPr>
-              <w:t>Recorded ContentSummary storage</w:t>
-            </w:r>
-          </w:p>
-        </w:tc>
-        <w:tc>
-          <w:tcPr>
-            <w:tcW w:type="dxa" w:w="3061"/>
-          </w:tcPr>
-          <w:p>
-            <w:pPr>
-              <w:spacing w:after="60" w:before="60" w:line="360" w:lineRule="auto"/>
-              <w:jc w:val="both"/>
-            </w:pPr>
-            <w:r>
-              <w:rPr>
-                <w:b w:val="0"/>
-                <w:sz w:val="24"/>
-                <w:rFonts w:ascii="Times New Roman" w:hAnsi="Times New Roman" w:eastAsia="Times New Roman" w:cs="Times New Roman"/>
-              </w:rPr>
-              <w:t>Await original laptop/lab values</w:t>
-            </w:r>
-          </w:p>
-        </w:tc>
-      </w:tr>
-      <w:tr>
-        <w:trPr>
-          <w:cantSplit/>
-        </w:trPr>
-        <w:tc>
-          <w:tcPr>
-            <w:tcW w:type="dxa" w:w="2835"/>
-          </w:tcPr>
-          <w:p>
-            <w:pPr>
-              <w:spacing w:after="60" w:before="60" w:line="360" w:lineRule="auto"/>
-              <w:jc w:val="both"/>
-            </w:pPr>
-            <w:r>
-              <w:rPr>
-                <w:b w:val="0"/>
-                <w:sz w:val="24"/>
-                <w:rFonts w:ascii="Times New Roman" w:hAnsi="Times New Roman" w:eastAsia="Times New Roman" w:cs="Times New Roman"/>
-              </w:rPr>
-              <w:t>Replication-adjusted space</w:t>
-            </w:r>
-          </w:p>
-        </w:tc>
-        <w:tc>
-          <w:tcPr>
-            <w:tcW w:type="dxa" w:w="3005"/>
-          </w:tcPr>
-          <w:p>
-            <w:pPr>
-              <w:spacing w:after="60" w:before="60" w:line="360" w:lineRule="auto"/>
-              <w:jc w:val="both"/>
-            </w:pPr>
-            <w:r>
-              <w:rPr>
-                <w:b w:val="0"/>
-                <w:sz w:val="24"/>
-                <w:rFonts w:ascii="Times New Roman" w:hAnsi="Times New Roman" w:eastAsia="Times New Roman" w:cs="Times New Roman"/>
-              </w:rPr>
-              <w:t>Recorded spaceConsumed values</w:t>
-            </w:r>
-          </w:p>
-        </w:tc>
-        <w:tc>
-          <w:tcPr>
-            <w:tcW w:type="dxa" w:w="3061"/>
-          </w:tcPr>
-          <w:p>
-            <w:pPr>
-              <w:spacing w:after="60" w:before="60" w:line="360" w:lineRule="auto"/>
-              <w:jc w:val="both"/>
-            </w:pPr>
-            <w:r>
-              <w:rPr>
-                <w:b w:val="0"/>
-                <w:sz w:val="24"/>
-                <w:rFonts w:ascii="Times New Roman" w:hAnsi="Times New Roman" w:eastAsia="Times New Roman" w:cs="Times New Roman"/>
-              </w:rPr>
-              <w:t>Await original laptop/lab values</w:t>
-            </w:r>
-          </w:p>
-        </w:tc>
-      </w:tr>
-      <w:tr>
-        <w:trPr>
-          <w:cantSplit/>
-        </w:trPr>
-        <w:tc>
-          <w:tcPr>
-            <w:tcW w:type="dxa" w:w="2835"/>
-          </w:tcPr>
-          <w:p>
-            <w:pPr>
-              <w:spacing w:after="60" w:before="60" w:line="360" w:lineRule="auto"/>
-              <w:jc w:val="both"/>
-            </w:pPr>
-            <w:r>
-              <w:rPr>
-                <w:b w:val="0"/>
-                <w:sz w:val="24"/>
-                <w:rFonts w:ascii="Times New Roman" w:hAnsi="Times New Roman" w:eastAsia="Times New Roman" w:cs="Times New Roman"/>
-              </w:rPr>
-              <w:t>Physical task placement</w:t>
-            </w:r>
-          </w:p>
-        </w:tc>
-        <w:tc>
-          <w:tcPr>
-            <w:tcW w:type="dxa" w:w="3005"/>
-          </w:tcPr>
-          <w:p>
-            <w:pPr>
-              <w:spacing w:after="60" w:before="60" w:line="360" w:lineRule="auto"/>
-              <w:jc w:val="both"/>
-            </w:pPr>
-            <w:r>
-              <w:rPr>
-                <w:b w:val="0"/>
-                <w:sz w:val="24"/>
-                <w:rFonts w:ascii="Times New Roman" w:hAnsi="Times New Roman" w:eastAsia="Times New Roman" w:cs="Times New Roman"/>
-              </w:rPr>
-              <w:t>JobHistory task-attempt records</w:t>
-            </w:r>
-          </w:p>
-        </w:tc>
-        <w:tc>
-          <w:tcPr>
-            <w:tcW w:type="dxa" w:w="3061"/>
-          </w:tcPr>
-          <w:p>
-            <w:pPr>
-              <w:spacing w:after="60" w:before="60" w:line="360" w:lineRule="auto"/>
-              <w:jc w:val="both"/>
-            </w:pPr>
-            <w:r>
-              <w:rPr>
-                <w:b w:val="0"/>
-                <w:sz w:val="24"/>
-                <w:rFonts w:ascii="Times New Roman" w:hAnsi="Times New Roman" w:eastAsia="Times New Roman" w:cs="Times New Roman"/>
-              </w:rPr>
-              <w:t>College execution pending</w:t>
-            </w:r>
-          </w:p>
-        </w:tc>
-      </w:tr>
-      <w:tr>
-        <w:trPr>
-          <w:cantSplit/>
-        </w:trPr>
-        <w:tc>
-          <w:tcPr>
-            <w:tcW w:type="dxa" w:w="2835"/>
-          </w:tcPr>
-          <w:p>
-            <w:pPr>
-              <w:spacing w:after="60" w:before="60" w:line="360" w:lineRule="auto"/>
-              <w:jc w:val="both"/>
-            </w:pPr>
-            <w:r>
-              <w:rPr>
-                <w:b w:val="0"/>
-                <w:sz w:val="24"/>
-                <w:rFonts w:ascii="Times New Roman" w:hAnsi="Times New Roman" w:eastAsia="Times New Roman" w:cs="Times New Roman"/>
-              </w:rPr>
-              <w:t>Full-data reconciliation</w:t>
-            </w:r>
-          </w:p>
-        </w:tc>
-        <w:tc>
-          <w:tcPr>
-            <w:tcW w:type="dxa" w:w="3005"/>
-          </w:tcPr>
-          <w:p>
-            <w:pPr>
-              <w:spacing w:after="60" w:before="60" w:line="360" w:lineRule="auto"/>
-              <w:jc w:val="both"/>
-            </w:pPr>
-            <w:r>
-              <w:rPr>
-                <w:b w:val="0"/>
-                <w:sz w:val="24"/>
-                <w:rFonts w:ascii="Times New Roman" w:hAnsi="Times New Roman" w:eastAsia="Times New Roman" w:cs="Times New Roman"/>
-              </w:rPr>
-              <w:t>reconciliation.json and complete run.json</w:t>
-            </w:r>
-          </w:p>
-        </w:tc>
-        <w:tc>
-          <w:tcPr>
-            <w:tcW w:type="dxa" w:w="3061"/>
-          </w:tcPr>
-          <w:p>
-            <w:pPr>
-              <w:spacing w:after="60" w:before="60" w:line="360" w:lineRule="auto"/>
-              <w:jc w:val="both"/>
-            </w:pPr>
-            <w:r>
-              <w:rPr>
-                <w:b w:val="0"/>
-                <w:sz w:val="24"/>
-                <w:rFonts w:ascii="Times New Roman" w:hAnsi="Times New Roman" w:eastAsia="Times New Roman" w:cs="Times New Roman"/>
-              </w:rPr>
-              <w:t>Full analytics pending</w:t>
-            </w:r>
-          </w:p>
-        </w:tc>
-      </w:tr>
-    </w:tbl>
-    <w:p>
-      <w:pPr>
-        <w:jc w:val="both"/>
-      </w:pPr>
-      <w:r>
-        <w:rPr>
-          <w:b w:val="0"/>
-          <w:sz w:val="24"/>
-          <w:rFonts w:ascii="Times New Roman" w:hAnsi="Times New Roman" w:eastAsia="Times New Roman" w:cs="Times New Roman"/>
-        </w:rPr>
-        <w:t>A smaller Text result on a tiny input would not invalidate RCFile; metadata and client overhead may dominate small workloads. Conversely, a compressed RCFile result is not proof of universal superiority. Valid discussion must state the selected input, number of repetitions, cache limitations, compression settings and measurement boundary.</w:t>
-      </w:r>
-    </w:p>
-    <w:p>
-      <w:pPr>
-        <w:pStyle w:val="Heading2"/>
-        <w:jc w:val="both"/>
-      </w:pPr>
-      <w:r>
-        <w:rPr>
-          <w:rFonts w:ascii="Times New Roman" w:hAnsi="Times New Roman" w:eastAsia="Times New Roman" w:cs="Times New Roman"/>
-          <w:sz w:val="28"/>
-          <w:b/>
-        </w:rPr>
-        <w:t>7.6 Functional validation matrix</w:t>
-      </w:r>
-    </w:p>
-    <w:p>
-      <w:bookmarkStart w:id="19" w:name="table_8"/>
-      <w:pPr>
-        <w:keepNext/>
-        <w:spacing w:before="80" w:after="120"/>
-        <w:jc w:val="both"/>
-      </w:pPr>
-      <w:r>
-        <w:rPr>
-          <w:b w:val="0"/>
-          <w:sz w:val="24"/>
-          <w:rFonts w:ascii="Times New Roman" w:hAnsi="Times New Roman" w:eastAsia="Times New Roman" w:cs="Times New Roman"/>
-        </w:rPr>
-        <w:t>Table 7.3 — Current completion and validation status</w:t>
-      </w:r>
-      <w:bookmarkEnd w:id="19"/>
-    </w:p>
-    <w:tbl>
-      <w:tblPr>
-        <w:tblStyle w:val="TableGrid"/>
-        <w:tblW w:type="auto" w:w="0"/>
-        <w:jc w:val="left"/>
-        <w:tblLayout w:type="fixed"/>
-        <w:tblLook w:firstColumn="1" w:firstRow="1" w:lastColumn="0" w:lastRow="0" w:noHBand="0" w:noVBand="1" w:val="04A0"/>
-      </w:tblPr>
-      <w:tblGrid>
-        <w:gridCol w:w="2835"/>
-        <w:gridCol w:w="3005"/>
-        <w:gridCol w:w="3061"/>
-      </w:tblGrid>
-      <w:tr>
-        <w:trPr>
-          <w:cantSplit/>
-          <w:tblHeader/>
-        </w:trPr>
-        <w:tc>
-          <w:tcPr>
-            <w:tcW w:type="dxa" w:w="2835"/>
-            <w:shd w:fill="EEEEEE"/>
-          </w:tcPr>
-          <w:p>
-            <w:pPr>
-              <w:spacing w:after="60" w:before="60" w:line="360" w:lineRule="auto"/>
-              <w:jc w:val="both"/>
-            </w:pPr>
-            <w:r>
-              <w:rPr>
-                <w:b/>
-                <w:sz w:val="24"/>
-                <w:rFonts w:ascii="Times New Roman" w:hAnsi="Times New Roman" w:eastAsia="Times New Roman" w:cs="Times New Roman"/>
-              </w:rPr>
-              <w:t>Area</w:t>
-            </w:r>
-          </w:p>
-        </w:tc>
-        <w:tc>
-          <w:tcPr>
-            <w:tcW w:type="dxa" w:w="3005"/>
-            <w:shd w:fill="EEEEEE"/>
-          </w:tcPr>
-          <w:p>
-            <w:pPr>
-              <w:spacing w:after="60" w:before="60" w:line="360" w:lineRule="auto"/>
-              <w:jc w:val="both"/>
-            </w:pPr>
-            <w:r>
-              <w:rPr>
-                <w:b/>
-                <w:sz w:val="24"/>
-                <w:rFonts w:ascii="Times New Roman" w:hAnsi="Times New Roman" w:eastAsia="Times New Roman" w:cs="Times New Roman"/>
-              </w:rPr>
-              <w:t>Available validation</w:t>
-            </w:r>
-          </w:p>
-        </w:tc>
-        <w:tc>
-          <w:tcPr>
-            <w:tcW w:type="dxa" w:w="3061"/>
-            <w:shd w:fill="EEEEEE"/>
-          </w:tcPr>
-          <w:p>
-            <w:pPr>
-              <w:spacing w:after="60" w:before="60" w:line="360" w:lineRule="auto"/>
-              <w:jc w:val="both"/>
-            </w:pPr>
-            <w:r>
-              <w:rPr>
-                <w:b/>
-                <w:sz w:val="24"/>
-                <w:rFonts w:ascii="Times New Roman" w:hAnsi="Times New Roman" w:eastAsia="Times New Roman" w:cs="Times New Roman"/>
-              </w:rPr>
-              <w:t>Status</w:t>
-            </w:r>
-          </w:p>
-        </w:tc>
-      </w:tr>
-      <w:tr>
-        <w:trPr>
-          <w:cantSplit/>
-        </w:trPr>
-        <w:tc>
-          <w:tcPr>
-            <w:tcW w:type="dxa" w:w="2835"/>
-          </w:tcPr>
-          <w:p>
-            <w:pPr>
-              <w:spacing w:after="60" w:before="60" w:line="360" w:lineRule="auto"/>
-              <w:jc w:val="both"/>
-            </w:pPr>
-            <w:r>
-              <w:rPr>
-                <w:b w:val="0"/>
-                <w:sz w:val="24"/>
-                <w:rFonts w:ascii="Times New Roman" w:hAnsi="Times New Roman" w:eastAsia="Times New Roman" w:cs="Times New Roman"/>
-              </w:rPr>
-              <w:t>Raw release preparation/import</w:t>
-            </w:r>
-          </w:p>
-        </w:tc>
-        <w:tc>
-          <w:tcPr>
-            <w:tcW w:type="dxa" w:w="3005"/>
-          </w:tcPr>
-          <w:p>
-            <w:pPr>
-              <w:spacing w:after="60" w:before="60" w:line="360" w:lineRule="auto"/>
-              <w:jc w:val="both"/>
-            </w:pPr>
-            <w:r>
-              <w:rPr>
-                <w:b w:val="0"/>
-                <w:sz w:val="24"/>
-                <w:rFonts w:ascii="Times New Roman" w:hAnsi="Times New Roman" w:eastAsia="Times New Roman" w:cs="Times New Roman"/>
-              </w:rPr>
-              <w:t>User's complete counts and manifest</w:t>
-            </w:r>
-          </w:p>
-        </w:tc>
-        <w:tc>
-          <w:tcPr>
-            <w:tcW w:type="dxa" w:w="3061"/>
-          </w:tcPr>
-          <w:p>
-            <w:pPr>
-              <w:spacing w:after="60" w:before="60" w:line="360" w:lineRule="auto"/>
-              <w:jc w:val="both"/>
-            </w:pPr>
-            <w:r>
-              <w:rPr>
-                <w:b w:val="0"/>
-                <w:sz w:val="24"/>
-                <w:rFonts w:ascii="Times New Roman" w:hAnsi="Times New Roman" w:eastAsia="Times New Roman" w:cs="Times New Roman"/>
-              </w:rPr>
-              <w:t>Completed on laptop</w:t>
+              <w:t>Completed</w:t>
             </w:r>
           </w:p>
         </w:tc>
@@ -7157,7 +6291,7 @@
                 <w:sz w:val="24"/>
                 <w:rFonts w:ascii="Times New Roman" w:hAnsi="Times New Roman" w:eastAsia="Times New Roman" w:cs="Times New Roman"/>
               </w:rPr>
-              <w:t>10,000 and 50,000-food outputs</w:t>
+              <w:t>10,000 and 50,000-food runs</w:t>
             </w:r>
           </w:p>
         </w:tc>
@@ -7176,7 +6310,7 @@
                 <w:sz w:val="24"/>
                 <w:rFonts w:ascii="Times New Roman" w:hAnsi="Times New Roman" w:eastAsia="Times New Roman" w:cs="Times New Roman"/>
               </w:rPr>
-              <w:t>Development checks passed</w:t>
+              <w:t>Passed</w:t>
             </w:r>
           </w:p>
         </w:tc>
@@ -7200,7 +6334,7 @@
                 <w:sz w:val="24"/>
                 <w:rFonts w:ascii="Times New Roman" w:hAnsi="Times New Roman" w:eastAsia="Times New Roman" w:cs="Times New Roman"/>
               </w:rPr>
-              <w:t>HDFS/YARN/MapReduce/Pig/Hive</w:t>
+              <w:t>HDFS operations</w:t>
             </w:r>
           </w:p>
         </w:tc>
@@ -7219,7 +6353,7 @@
                 <w:sz w:val="24"/>
                 <w:rFonts w:ascii="Times New Roman" w:hAnsi="Times New Roman" w:eastAsia="Times New Roman" w:cs="Times New Roman"/>
               </w:rPr>
-              <w:t>Linked subset integration success</w:t>
+              <w:t>Upload/read/download and byte comparison</w:t>
             </w:r>
           </w:p>
         </w:tc>
@@ -7238,7 +6372,7 @@
                 <w:sz w:val="24"/>
                 <w:rFonts w:ascii="Times New Roman" w:hAnsi="Times New Roman" w:eastAsia="Times New Roman" w:cs="Times New Roman"/>
               </w:rPr>
-              <w:t>Development checks passed</w:t>
+              <w:t>Passed</w:t>
             </w:r>
           </w:p>
         </w:tc>
@@ -7262,7 +6396,7 @@
                 <w:sz w:val="24"/>
                 <w:rFonts w:ascii="Times New Roman" w:hAnsi="Times New Roman" w:eastAsia="Times New Roman" w:cs="Times New Roman"/>
               </w:rPr>
-              <w:t>Dashboard and progress fixes</w:t>
+              <w:t>MapReduce / Pig</w:t>
             </w:r>
           </w:p>
         </w:tc>
@@ -7281,7 +6415,7 @@
                 <w:sz w:val="24"/>
                 <w:rFonts w:ascii="Times New Roman" w:hAnsi="Times New Roman" w:eastAsia="Times New Roman" w:cs="Times New Roman"/>
               </w:rPr>
-              <w:t>46-test record and browser checks</w:t>
+              <w:t>Independent summaries and cleaned counts</w:t>
             </w:r>
           </w:p>
         </w:tc>
@@ -7300,7 +6434,7 @@
                 <w:sz w:val="24"/>
                 <w:rFonts w:ascii="Times New Roman" w:hAnsi="Times New Roman" w:eastAsia="Times New Roman" w:cs="Times New Roman"/>
               </w:rPr>
-              <w:t>Implementation validated</w:t>
+              <w:t>Passed</w:t>
             </w:r>
           </w:p>
         </w:tc>
@@ -7324,7 +6458,7 @@
                 <w:sz w:val="24"/>
                 <w:rFonts w:ascii="Times New Roman" w:hAnsi="Times New Roman" w:eastAsia="Times New Roman" w:cs="Times New Roman"/>
               </w:rPr>
-              <w:t>Entire-release analytical execution</w:t>
+              <w:t>Hive Text / RCFile</w:t>
             </w:r>
           </w:p>
         </w:tc>
@@ -7343,7 +6477,7 @@
                 <w:sz w:val="24"/>
                 <w:rFonts w:ascii="Times New Roman" w:hAnsi="Times New Roman" w:eastAsia="Times New Roman" w:cs="Times New Roman"/>
               </w:rPr>
-              <w:t>Interrupted full analytical run</w:t>
+              <w:t>Equivalent query results</w:t>
             </w:r>
           </w:p>
         </w:tc>
@@ -7362,7 +6496,7 @@
                 <w:sz w:val="24"/>
                 <w:rFonts w:ascii="Times New Roman" w:hAnsi="Times New Roman" w:eastAsia="Times New Roman" w:cs="Times New Roman"/>
               </w:rPr>
-              <w:t>Pending</w:t>
+              <w:t>Passed</w:t>
             </w:r>
           </w:p>
         </w:tc>
@@ -7386,7 +6520,7 @@
                 <w:sz w:val="24"/>
                 <w:rFonts w:ascii="Times New Roman" w:hAnsi="Times New Roman" w:eastAsia="Times New Roman" w:cs="Times New Roman"/>
               </w:rPr>
-              <w:t>Three physical lab computers</w:t>
+              <w:t>Dashboard</w:t>
             </w:r>
           </w:p>
         </w:tc>
@@ -7405,7 +6539,7 @@
                 <w:sz w:val="24"/>
                 <w:rFonts w:ascii="Times New Roman" w:hAnsi="Times New Roman" w:eastAsia="Times New Roman" w:cs="Times New Roman"/>
               </w:rPr>
-              <w:t>Deployment guide prepared</w:t>
+              <w:t>Automated and browser checks</w:t>
             </w:r>
           </w:p>
         </w:tc>
@@ -7424,15 +6558,17 @@
                 <w:sz w:val="24"/>
                 <w:rFonts w:ascii="Times New Roman" w:hAnsi="Times New Roman" w:eastAsia="Times New Roman" w:cs="Times New Roman"/>
               </w:rPr>
-              <w:t>Execution and evidence pending</w:t>
+              <w:t>Passed</w:t>
             </w:r>
           </w:p>
         </w:tc>
       </w:tr>
     </w:tbl>
     <w:p>
-      <w:pPr>
-        <w:pStyle w:val="Heading2"/>
+      <w:bookmarkStart w:id="19" w:name="chapter_8"/>
+      <w:pPr>
+        <w:pStyle w:val="Heading1"/>
+        <w:pageBreakBefore/>
         <w:jc w:val="both"/>
       </w:pPr>
       <w:r>
@@ -7441,8 +6577,9 @@
           <w:sz w:val="28"/>
           <w:b/>
         </w:rPr>
-        <w:t>7.7 Limitations and threats to validity</w:t>
+        <w:t>CHAPTER 8: CONCLUSION</w:t>
       </w:r>
+      <w:bookmarkEnd w:id="19"/>
     </w:p>
     <w:p>
       <w:pPr>
@@ -7454,7 +6591,7 @@
           <w:sz w:val="24"/>
           <w:rFonts w:ascii="Times New Roman" w:hAnsi="Times New Roman" w:eastAsia="Times New Roman" w:cs="Times New Roman"/>
         </w:rPr>
-        <w:t>Deterministic source-order subsets introduce selection bias. Warm-cache query repetition and Beeline startup affect elapsed-time interpretation. One laptop cannot demonstrate physical scaling even when three logical nodes are registered. HDFS-reported virtual capacity must not be mistaken for the Windows host's actual free storage, and replicated bytes must not be confused with logical file length.</w:t>
+        <w:t>The project integrates MongoDB document processing, HDFS storage, YARN MapReduce, Pig transformation and Hive analytics for USDA FoodData Central. Its three core themes cover ingestion and profiling, distributed file and data processing, and comparison of Text and RCFile analytical storage. The Flask dashboard provides a unified interface for the Track B practical extension.</w:t>
       </w:r>
     </w:p>
     <w:p>
@@ -7467,38 +6604,7 @@
           <w:sz w:val="24"/>
           <w:rFonts w:ascii="Times New Roman" w:hAnsi="Times New Roman" w:eastAsia="Times New Roman" w:cs="Times New Roman"/>
         </w:rPr>
-        <w:t>Nutrient observations may be sparse, and the current group summaries do not answer every product-level or dietary question. The project does not establish population representativeness, clinical recommendations or uniform serving-basis normalization. Final conclusions about full-data scalability, cluster balancing and storage savings require the planned physical-system measurements.</w:t>
-      </w:r>
-    </w:p>
-    <w:p>
-      <w:bookmarkStart w:id="20" w:name="chapter_8"/>
-      <w:pPr>
-        <w:pStyle w:val="Heading1"/>
-        <w:pageBreakBefore/>
-        <w:jc w:val="both"/>
-      </w:pPr>
-      <w:r>
-        <w:rPr>
-          <w:rFonts w:ascii="Times New Roman" w:hAnsi="Times New Roman" w:eastAsia="Times New Roman" w:cs="Times New Roman"/>
-          <w:sz w:val="28"/>
-          <w:b/>
-        </w:rPr>
-        <w:t>CHAPTER 8: DEPLOYMENT AND DEMONSTRATION</w:t>
-      </w:r>
-      <w:bookmarkEnd w:id="20"/>
-    </w:p>
-    <w:p>
-      <w:pPr>
-        <w:pStyle w:val="Heading2"/>
-        <w:jc w:val="both"/>
-      </w:pPr>
-      <w:r>
-        <w:rPr>
-          <w:rFonts w:ascii="Times New Roman" w:hAnsi="Times New Roman" w:eastAsia="Times New Roman" w:cs="Times New Roman"/>
-          <w:sz w:val="28"/>
-          <w:b/>
-        </w:rPr>
-        <w:t>8.1 Laptop demonstration</w:t>
+        <w:t>The complete release was prepared and imported into MongoDB. The reported analytical experiments use linked subsets of 10,000 and 50,000 foods, including 1,126,928 nutrient observations in the larger subset. Cross-system reconciliation confirms consistent counts, totals and means for those selected workloads. The recorded point-query experiment also demonstrates the reduction in examined documents provided by an appropriate index.</w:t>
       </w:r>
     </w:p>
     <w:p>
@@ -7511,353 +6617,11 @@
           <w:sz w:val="24"/>
           <w:rFonts w:ascii="Times New Roman" w:hAnsi="Times New Roman" w:eastAsia="Times New Roman" w:cs="Times New Roman"/>
         </w:rPr>
-        <w:t>On the existing Ubuntu installation, update the checkout and start the dashboard using the project virtual environment. Saved results can be viewed with MongoDB and Hadoop stopped. For a new 50,000-food test, use Run analysis and allow the worker to switch services; do not start duplicate Terminal workflows.</w:t>
+        <w:t>The resulting system connects source data, processing stages and analytical outputs through a reproducible workflow. Its architecture and dashboard make the role of each technology visible while retaining a common basis for comparing the results.</w:t>
       </w:r>
     </w:p>
     <w:p>
-      <w:pPr>
-        <w:keepNext/>
-        <w:spacing w:before="0" w:after="0" w:line="276" w:lineRule="auto"/>
-        <w:jc w:val="both"/>
-        <w:shd w:fill="F4F4F4"/>
-      </w:pPr>
-      <w:r>
-        <w:rPr>
-          <w:b w:val="0"/>
-          <w:sz w:val="24"/>
-          <w:rFonts w:ascii="Times New Roman" w:hAnsi="Times New Roman" w:eastAsia="Times New Roman" w:cs="Times New Roman"/>
-        </w:rPr>
-        <w:t>cd ~/BDA-Assignment</w:t>
-      </w:r>
-    </w:p>
-    <w:p>
-      <w:pPr>
-        <w:keepNext/>
-        <w:spacing w:before="0" w:after="0" w:line="276" w:lineRule="auto"/>
-        <w:jc w:val="both"/>
-        <w:shd w:fill="F4F4F4"/>
-      </w:pPr>
-      <w:r>
-        <w:rPr>
-          <w:b w:val="0"/>
-          <w:sz w:val="24"/>
-          <w:rFonts w:ascii="Times New Roman" w:hAnsi="Times New Roman" w:eastAsia="Times New Roman" w:cs="Times New Roman"/>
-        </w:rPr>
-        <w:t>git pull --ff-only origin main</w:t>
-      </w:r>
-    </w:p>
-    <w:p>
-      <w:pPr>
-        <w:keepNext w:val="0"/>
-        <w:spacing w:before="0" w:after="0" w:line="276" w:lineRule="auto"/>
-        <w:jc w:val="both"/>
-        <w:shd w:fill="F4F4F4"/>
-      </w:pPr>
-      <w:r>
-        <w:rPr>
-          <w:b w:val="0"/>
-          <w:sz w:val="24"/>
-          <w:rFonts w:ascii="Times New Roman" w:hAnsi="Times New Roman" w:eastAsia="Times New Roman" w:cs="Times New Roman"/>
-        </w:rPr>
-        <w:t>.venv/bin/python -m fdc.dashboard</w:t>
-      </w:r>
-    </w:p>
-    <w:p>
-      <w:pPr>
-        <w:jc w:val="both"/>
-      </w:pPr>
-      <w:r>
-        <w:rPr>
-          <w:b w:val="0"/>
-          <w:sz w:val="24"/>
-          <w:rFonts w:ascii="Times New Roman" w:hAnsi="Times New Roman" w:eastAsia="Times New Roman" w:cs="Times New Roman"/>
-        </w:rPr>
-        <w:t>Choose View results to present an existing evidence folder. Choose Run analysis to process a new selected scope and demonstrate the live stages. The laptop guide and the 50,000-food guide contain the complete command sequence and explain which artifacts are reused. Generated data and results are excluded from the GitHub repository and need a separate backup.</w:t>
-      </w:r>
-    </w:p>
-    <w:p>
-      <w:pPr>
-        <w:pStyle w:val="Heading2"/>
-        <w:jc w:val="both"/>
-      </w:pPr>
-      <w:r>
-        <w:rPr>
-          <w:rFonts w:ascii="Times New Roman" w:hAnsi="Times New Roman" w:eastAsia="Times New Roman" w:cs="Times New Roman"/>
-          <w:sz w:val="28"/>
-          <w:b/>
-        </w:rPr>
-        <w:t>8.2 Three-system deployment procedure</w:t>
-      </w:r>
-    </w:p>
-    <w:p>
-      <w:pPr>
-        <w:jc w:val="both"/>
-      </w:pPr>
-      <w:r>
-        <w:rPr>
-          <w:b w:val="0"/>
-          <w:sz w:val="24"/>
-          <w:rFonts w:ascii="Times New Roman" w:hAnsi="Times New Roman" w:eastAsia="Times New Roman" w:cs="Times New Roman"/>
-        </w:rPr>
-        <w:t>The detailed lab walkthrough installs prerequisites rather than assuming an existing cluster. It assigns one master and two workers, configures matching host mappings and SSH, installs compatible Java/Hadoop versions, prepares HDFS directories and verifies registration before dataset execution. Workers require network access to the actual Hadoop/YARN services, not only SSH.</w:t>
-      </w:r>
-    </w:p>
-    <w:p>
-      <w:pPr>
-        <w:jc w:val="both"/>
-      </w:pPr>
-      <w:r>
-        <w:rPr>
-          <w:b w:val="0"/>
-          <w:sz w:val="24"/>
-          <w:rFonts w:ascii="Times New Roman" w:hAnsi="Times New Roman" w:eastAsia="Times New Roman" w:cs="Times New Roman"/>
-        </w:rPr>
-        <w:t>The master runs the following workflow after the lab guide's preparation and service checks. The run identifier must be new. The dataset ZIP is copied to the master and its CRC and SHA-256 are checked before the full run.</w:t>
-      </w:r>
-    </w:p>
-    <w:p>
-      <w:pPr>
-        <w:keepNext/>
-        <w:spacing w:before="0" w:after="0" w:line="276" w:lineRule="auto"/>
-        <w:jc w:val="both"/>
-        <w:shd w:fill="F4F4F4"/>
-      </w:pPr>
-      <w:r>
-        <w:rPr>
-          <w:b w:val="0"/>
-          <w:sz w:val="24"/>
-          <w:rFonts w:ascii="Times New Roman" w:hAnsi="Times New Roman" w:eastAsia="Times New Roman" w:cs="Times New Roman"/>
-        </w:rPr>
-        <w:t>.venv/bin/python -m fdc.part1 \</w:t>
-      </w:r>
-    </w:p>
-    <w:p>
-      <w:pPr>
-        <w:keepNext/>
-        <w:spacing w:before="0" w:after="0" w:line="276" w:lineRule="auto"/>
-        <w:jc w:val="both"/>
-        <w:shd w:fill="F4F4F4"/>
-      </w:pPr>
-      <w:r>
-        <w:rPr>
-          <w:b w:val="0"/>
-          <w:sz w:val="24"/>
-          <w:rFonts w:ascii="Times New Roman" w:hAnsi="Times New Roman" w:eastAsia="Times New Roman" w:cs="Times New Roman"/>
-        </w:rPr>
-        <w:t xml:space="preserve">  --archive data/raw/FoodData_Central_csv_2024-10-31.zip \</w:t>
-      </w:r>
-    </w:p>
-    <w:p>
-      <w:pPr>
-        <w:keepNext/>
-        <w:spacing w:before="0" w:after="0" w:line="276" w:lineRule="auto"/>
-        <w:jc w:val="both"/>
-        <w:shd w:fill="F4F4F4"/>
-      </w:pPr>
-      <w:r>
-        <w:rPr>
-          <w:b w:val="0"/>
-          <w:sz w:val="24"/>
-          <w:rFonts w:ascii="Times New Roman" w:hAnsi="Times New Roman" w:eastAsia="Times New Roman" w:cs="Times New Roman"/>
-        </w:rPr>
-        <w:t xml:space="preserve">  --run-id college_full01 --dataset-kind full-release \</w:t>
-      </w:r>
-    </w:p>
-    <w:p>
-      <w:pPr>
-        <w:keepNext w:val="0"/>
-        <w:spacing w:before="0" w:after="0" w:line="276" w:lineRule="auto"/>
-        <w:jc w:val="both"/>
-        <w:shd w:fill="F4F4F4"/>
-      </w:pPr>
-      <w:r>
-        <w:rPr>
-          <w:b w:val="0"/>
-          <w:sz w:val="24"/>
-          <w:rFonts w:ascii="Times New Roman" w:hAnsi="Times New Roman" w:eastAsia="Times New Roman" w:cs="Times New Roman"/>
-        </w:rPr>
-        <w:t xml:space="preserve">  --cluster-mode client --repeats 5</w:t>
-      </w:r>
-    </w:p>
-    <w:p>
-      <w:pPr>
-        <w:jc w:val="both"/>
-      </w:pPr>
-      <w:r>
-        <w:rPr>
-          <w:b w:val="0"/>
-          <w:sz w:val="24"/>
-          <w:rFonts w:ascii="Times New Roman" w:hAnsi="Times New Roman" w:eastAsia="Times New Roman" w:cs="Times New Roman"/>
-        </w:rPr>
-        <w:t>All three systems remain awake while the job runs. Never format an existing NameNode or recreate a metastore simply to resolve a website update. Check completion and reconciliation before presenting the dashboard. The physical deployment described here is a prepared procedure, not an experiment already completed on the college machines.</w:t>
-      </w:r>
-    </w:p>
-    <w:p>
-      <w:pPr>
-        <w:pStyle w:val="Heading2"/>
-        <w:jc w:val="both"/>
-      </w:pPr>
-      <w:r>
-        <w:rPr>
-          <w:rFonts w:ascii="Times New Roman" w:hAnsi="Times New Roman" w:eastAsia="Times New Roman" w:cs="Times New Roman"/>
-          <w:sz w:val="28"/>
-          <w:b/>
-        </w:rPr>
-        <w:t>8.3 Evidence to capture for the presentation</w:t>
-      </w:r>
-    </w:p>
-    <w:p>
-      <w:pPr>
-        <w:jc w:val="both"/>
-      </w:pPr>
-      <w:r>
-        <w:rPr>
-          <w:b w:val="0"/>
-          <w:sz w:val="24"/>
-          <w:rFonts w:ascii="Times New Roman" w:hAnsi="Times New Roman" w:eastAsia="Times New Roman" w:cs="Times New Roman"/>
-        </w:rPr>
-        <w:t>Capture the actual master and worker machine inventory, two live DataNodes, two RUNNING NodeManagers and a successful sample job. Retain a Streaming application ID and task-attempt placement on both workers. Show a MongoDB aggregation and its index comparison, the Pig script and cleaned count, and identical Hive answers on Text and RCFile.</w:t>
-      </w:r>
-    </w:p>
-    <w:p>
-      <w:pPr>
-        <w:jc w:val="both"/>
-      </w:pPr>
-      <w:r>
-        <w:rPr>
-          <w:b w:val="0"/>
-          <w:sz w:val="24"/>
-          <w:rFonts w:ascii="Times New Roman" w:hAnsi="Times New Roman" w:eastAsia="Times New Roman" w:cs="Times New Roman"/>
-        </w:rPr>
-        <w:t>Capture screenshots from the user's selected real-data run: the dataset scope, three theme checklists, executionStats table, Hive query/storage comparison and current process panel. Screenshots have not been invented or substituted with synthetic outputs in this report. Insert those screenshots with captions before the final submission.</w:t>
-      </w:r>
-    </w:p>
-    <w:p>
-      <w:bookmarkStart w:id="21" w:name="chapter_9"/>
-      <w:pPr>
-        <w:pStyle w:val="Heading1"/>
-        <w:pageBreakBefore/>
-        <w:jc w:val="both"/>
-      </w:pPr>
-      <w:r>
-        <w:rPr>
-          <w:rFonts w:ascii="Times New Roman" w:hAnsi="Times New Roman" w:eastAsia="Times New Roman" w:cs="Times New Roman"/>
-          <w:sz w:val="28"/>
-          <w:b/>
-        </w:rPr>
-        <w:t>CHAPTER 9: CONCLUSION AND FUTURE WORK</w:t>
-      </w:r>
-      <w:bookmarkEnd w:id="21"/>
-    </w:p>
-    <w:p>
-      <w:pPr>
-        <w:pStyle w:val="Heading2"/>
-        <w:jc w:val="both"/>
-      </w:pPr>
-      <w:r>
-        <w:rPr>
-          <w:rFonts w:ascii="Times New Roman" w:hAnsi="Times New Roman" w:eastAsia="Times New Roman" w:cs="Times New Roman"/>
-          <w:sz w:val="28"/>
-          <w:b/>
-        </w:rPr>
-        <w:t>9.1 Conclusion</w:t>
-      </w:r>
-    </w:p>
-    <w:p>
-      <w:pPr>
-        <w:jc w:val="both"/>
-      </w:pPr>
-      <w:r>
-        <w:rPr>
-          <w:b w:val="0"/>
-          <w:sz w:val="24"/>
-          <w:rFonts w:ascii="Times New Roman" w:hAnsi="Times New Roman" w:eastAsia="Times New Roman" w:cs="Times New Roman"/>
-        </w:rPr>
-        <w:t>The implemented system connects document processing, distributed file storage, Python MapReduce, Pig transformation and Hive benchmarking for the USDA FoodData Central release. The Flask extension adds an understandable interface for recorded evidence and controlled laptop execution. Source fingerprints, explicit scope labels, count checks and independent reconciliation make the results more defensible than isolated tool demonstrations.</w:t>
-      </w:r>
-    </w:p>
-    <w:p>
-      <w:pPr>
-        <w:jc w:val="both"/>
-      </w:pPr>
-      <w:r>
-        <w:rPr>
-          <w:b w:val="0"/>
-          <w:sz w:val="24"/>
-          <w:rFonts w:ascii="Times New Roman" w:hAnsi="Times New Roman" w:eastAsia="Times New Roman" w:cs="Times New Roman"/>
-        </w:rPr>
-        <w:t>The completed full raw import and successful 10,000- and 50,000-food development workflows establish an implemented and tested pipeline at those scopes. The recorded index experiment demonstrates substantially lower examined-document work for a selected indexed lookup. The report does not assert that full-data analytics or the mandated physical lab deployment has been completed.</w:t>
-      </w:r>
-    </w:p>
-    <w:p>
-      <w:pPr>
-        <w:pStyle w:val="Heading2"/>
-        <w:jc w:val="both"/>
-      </w:pPr>
-      <w:r>
-        <w:rPr>
-          <w:rFonts w:ascii="Times New Roman" w:hAnsi="Times New Roman" w:eastAsia="Times New Roman" w:cs="Times New Roman"/>
-          <w:sz w:val="28"/>
-          <w:b/>
-        </w:rPr>
-        <w:t>9.2 Work required before final submission</w:t>
-      </w:r>
-    </w:p>
-    <w:p>
-      <w:pPr>
-        <w:jc w:val="both"/>
-      </w:pPr>
-      <w:r>
-        <w:rPr>
-          <w:b w:val="0"/>
-          <w:sz w:val="24"/>
-          <w:rFonts w:ascii="Times New Roman" w:hAnsi="Times New Roman" w:eastAsia="Times New Roman" w:cs="Times New Roman"/>
-        </w:rPr>
-        <w:t>Execute the full release on the three college systems, record the hardware/network inventory and actual task placement, and retain the successful reconciliation files. Transfer the measured Hive timing and storage results into Chapter 7, include real screenshots, and have the institutional front pages completed and verified. Confirm that the faculty accepts the demonstrated deployment and scope before describing the assignment as fully complete.</w:t>
-      </w:r>
-    </w:p>
-    <w:p>
-      <w:pPr>
-        <w:pStyle w:val="Heading2"/>
-        <w:jc w:val="both"/>
-      </w:pPr>
-      <w:r>
-        <w:rPr>
-          <w:rFonts w:ascii="Times New Roman" w:hAnsi="Times New Roman" w:eastAsia="Times New Roman" w:cs="Times New Roman"/>
-          <w:sz w:val="28"/>
-          <w:b/>
-        </w:rPr>
-        <w:t>9.3 Future enhancements</w:t>
-      </w:r>
-    </w:p>
-    <w:p>
-      <w:pPr>
-        <w:jc w:val="both"/>
-      </w:pPr>
-      <w:r>
-        <w:rPr>
-          <w:b w:val="0"/>
-          <w:sz w:val="24"/>
-          <w:rFonts w:ascii="Times New Roman" w:hAnsi="Times New Roman" w:eastAsia="Times New Roman" w:cs="Times New Roman"/>
-        </w:rPr>
-        <w:t>Future work may add food-description search and individual-product details, a clearer nutrient-name mapping in summary views, additional scientifically appropriate normalization and richer monitoring of resource consumption. A later engineering study could vary split sizes, reducer counts and resource allocations to examine scalability, while keeping that study separate from the chosen dashboard extension.</w:t>
-      </w:r>
-    </w:p>
-    <w:p>
-      <w:pPr>
-        <w:jc w:val="both"/>
-      </w:pPr>
-      <w:r>
-        <w:rPr>
-          <w:b w:val="0"/>
-          <w:sz w:val="24"/>
-          <w:rFonts w:ascii="Times New Roman" w:hAnsi="Times New Roman" w:eastAsia="Times New Roman" w:cs="Times New Roman"/>
-        </w:rPr>
-        <w:t>Production use would require stronger authentication, service isolation, a supported multi-user metastore, backup policy and review of the legacy stack. These are prospective enhancements rather than features claimed by the current teaching implementation.</w:t>
-      </w:r>
-    </w:p>
-    <w:p>
-      <w:bookmarkStart w:id="22" w:name="chapter_10"/>
+      <w:bookmarkStart w:id="20" w:name="chapter_9"/>
       <w:pPr>
         <w:pStyle w:val="Heading1"/>
         <w:pageBreakBefore/>
@@ -7871,7 +6635,7 @@
         </w:rPr>
         <w:t>REFERENCES</w:t>
       </w:r>
-      <w:bookmarkEnd w:id="22"/>
+      <w:bookmarkEnd w:id="20"/>
     </w:p>
     <w:p>
       <w:pPr>
@@ -7987,988 +6751,7 @@
           <w:sz w:val="24"/>
           <w:rFonts w:ascii="Times New Roman" w:hAnsi="Times New Roman" w:eastAsia="Times New Roman" w:cs="Times New Roman"/>
         </w:rPr>
-        <w:t>[9] Dhanush-singh-g, “BDA-Assignment,” https://github.com/Dhanush-singh-g/BDA-Assignment . Implementation, deployment guides and validation record; this report describes repository state through commit 2e9b3f9 and the recorded project discussion.</w:t>
-      </w:r>
-    </w:p>
-    <w:p>
-      <w:bookmarkStart w:id="23" w:name="chapter_11"/>
-      <w:pPr>
-        <w:pStyle w:val="Heading1"/>
-        <w:pageBreakBefore/>
-        <w:jc w:val="both"/>
-      </w:pPr>
-      <w:r>
-        <w:rPr>
-          <w:rFonts w:ascii="Times New Roman" w:hAnsi="Times New Roman" w:eastAsia="Times New Roman" w:cs="Times New Roman"/>
-          <w:sz w:val="28"/>
-          <w:b/>
-        </w:rPr>
-        <w:t>APPENDIX A: REPRESENTATIVE IMPLEMENTATION</w:t>
-      </w:r>
-      <w:bookmarkEnd w:id="23"/>
-    </w:p>
-    <w:p>
-      <w:pPr>
-        <w:pStyle w:val="Heading2"/>
-        <w:jc w:val="both"/>
-      </w:pPr>
-      <w:r>
-        <w:rPr>
-          <w:rFonts w:ascii="Times New Roman" w:hAnsi="Times New Roman" w:eastAsia="Times New Roman" w:cs="Times New Roman"/>
-          <w:sz w:val="28"/>
-          <w:b/>
-        </w:rPr>
-        <w:t>A.1 Pig cleaning script</w:t>
-      </w:r>
-    </w:p>
-    <w:p>
-      <w:pPr>
-        <w:jc w:val="both"/>
-      </w:pPr>
-      <w:r>
-        <w:rPr>
-          <w:b w:val="0"/>
-          <w:sz w:val="24"/>
-          <w:rFonts w:ascii="Times New Roman" w:hAnsi="Times New Roman" w:eastAsia="Times New Roman" w:cs="Times New Roman"/>
-        </w:rPr>
-        <w:t>The following is the implemented distributed transformation. INPUT and OUTPUT are supplied as run parameters. The complete source is pig/clean_nutrients.pig in the repository.</w:t>
-      </w:r>
-    </w:p>
-    <w:p>
-      <w:pPr>
-        <w:keepNext/>
-        <w:spacing w:before="0" w:after="0" w:line="276" w:lineRule="auto"/>
-        <w:jc w:val="both"/>
-        <w:shd w:fill="F4F4F4"/>
-      </w:pPr>
-      <w:r>
-        <w:rPr>
-          <w:b w:val="0"/>
-          <w:sz w:val="24"/>
-          <w:rFonts w:ascii="Times New Roman" w:hAnsi="Times New Roman" w:eastAsia="Times New Roman" w:cs="Times New Roman"/>
-        </w:rPr>
-        <w:t>raw = LOAD '$INPUT' USING PigStorage('\t') AS (</w:t>
-      </w:r>
-    </w:p>
-    <w:p>
-      <w:pPr>
-        <w:keepNext/>
-        <w:spacing w:before="0" w:after="0" w:line="276" w:lineRule="auto"/>
-        <w:jc w:val="both"/>
-        <w:shd w:fill="F4F4F4"/>
-      </w:pPr>
-      <w:r>
-        <w:rPr>
-          <w:b w:val="0"/>
-          <w:sz w:val="24"/>
-          <w:rFonts w:ascii="Times New Roman" w:hAnsi="Times New Roman" w:eastAsia="Times New Roman" w:cs="Times New Roman"/>
-        </w:rPr>
-        <w:t xml:space="preserve">    fdc_id:long, data_type:chararray,</w:t>
-      </w:r>
-    </w:p>
-    <w:p>
-      <w:pPr>
-        <w:keepNext/>
-        <w:spacing w:before="0" w:after="0" w:line="276" w:lineRule="auto"/>
-        <w:jc w:val="both"/>
-        <w:shd w:fill="F4F4F4"/>
-      </w:pPr>
-      <w:r>
-        <w:rPr>
-          <w:b w:val="0"/>
-          <w:sz w:val="24"/>
-          <w:rFonts w:ascii="Times New Roman" w:hAnsi="Times New Roman" w:eastAsia="Times New Roman" w:cs="Times New Roman"/>
-        </w:rPr>
-        <w:t xml:space="preserve">    food_category_id:chararray, nutrient_id:int,</w:t>
-      </w:r>
-    </w:p>
-    <w:p>
-      <w:pPr>
-        <w:keepNext/>
-        <w:spacing w:before="0" w:after="0" w:line="276" w:lineRule="auto"/>
-        <w:jc w:val="both"/>
-        <w:shd w:fill="F4F4F4"/>
-      </w:pPr>
-      <w:r>
-        <w:rPr>
-          <w:b w:val="0"/>
-          <w:sz w:val="24"/>
-          <w:rFonts w:ascii="Times New Roman" w:hAnsi="Times New Roman" w:eastAsia="Times New Roman" w:cs="Times New Roman"/>
-        </w:rPr>
-        <w:t xml:space="preserve">    nutrient_name:chararray, unit:chararray,</w:t>
-      </w:r>
-    </w:p>
-    <w:p>
-      <w:pPr>
-        <w:keepNext/>
-        <w:spacing w:before="0" w:after="0" w:line="276" w:lineRule="auto"/>
-        <w:jc w:val="both"/>
-        <w:shd w:fill="F4F4F4"/>
-      </w:pPr>
-      <w:r>
-        <w:rPr>
-          <w:b w:val="0"/>
-          <w:sz w:val="24"/>
-          <w:rFonts w:ascii="Times New Roman" w:hAnsi="Times New Roman" w:eastAsia="Times New Roman" w:cs="Times New Roman"/>
-        </w:rPr>
-        <w:t xml:space="preserve">    amount:double</w:t>
-      </w:r>
-    </w:p>
-    <w:p>
-      <w:pPr>
-        <w:keepNext/>
-        <w:spacing w:before="0" w:after="0" w:line="276" w:lineRule="auto"/>
-        <w:jc w:val="both"/>
-        <w:shd w:fill="F4F4F4"/>
-      </w:pPr>
-      <w:r>
-        <w:rPr>
-          <w:b w:val="0"/>
-          <w:sz w:val="24"/>
-          <w:rFonts w:ascii="Times New Roman" w:hAnsi="Times New Roman" w:eastAsia="Times New Roman" w:cs="Times New Roman"/>
-        </w:rPr>
-        <w:t>);</w:t>
-      </w:r>
-    </w:p>
-    <w:p>
-      <w:pPr>
-        <w:keepNext/>
-        <w:spacing w:before="0" w:after="0" w:line="276" w:lineRule="auto"/>
-        <w:jc w:val="both"/>
-        <w:shd w:fill="F4F4F4"/>
-      </w:pPr>
-      <w:r>
-        <w:rPr>
-          <w:b w:val="0"/>
-          <w:sz w:val="24"/>
-          <w:rFonts w:ascii="Times New Roman" w:hAnsi="Times New Roman" w:eastAsia="Times New Roman" w:cs="Times New Roman"/>
-        </w:rPr>
-        <w:t>clean = FILTER raw BY fdc_id IS NOT NULL</w:t>
-      </w:r>
-    </w:p>
-    <w:p>
-      <w:pPr>
-        <w:keepNext/>
-        <w:spacing w:before="0" w:after="0" w:line="276" w:lineRule="auto"/>
-        <w:jc w:val="both"/>
-        <w:shd w:fill="F4F4F4"/>
-      </w:pPr>
-      <w:r>
-        <w:rPr>
-          <w:b w:val="0"/>
-          <w:sz w:val="24"/>
-          <w:rFonts w:ascii="Times New Roman" w:hAnsi="Times New Roman" w:eastAsia="Times New Roman" w:cs="Times New Roman"/>
-        </w:rPr>
-        <w:t xml:space="preserve">    AND nutrient_id IS NOT NULL</w:t>
-      </w:r>
-    </w:p>
-    <w:p>
-      <w:pPr>
-        <w:keepNext/>
-        <w:spacing w:before="0" w:after="0" w:line="276" w:lineRule="auto"/>
-        <w:jc w:val="both"/>
-        <w:shd w:fill="F4F4F4"/>
-      </w:pPr>
-      <w:r>
-        <w:rPr>
-          <w:b w:val="0"/>
-          <w:sz w:val="24"/>
-          <w:rFonts w:ascii="Times New Roman" w:hAnsi="Times New Roman" w:eastAsia="Times New Roman" w:cs="Times New Roman"/>
-        </w:rPr>
-        <w:t xml:space="preserve">    AND data_type IS NOT NULL</w:t>
-      </w:r>
-    </w:p>
-    <w:p>
-      <w:pPr>
-        <w:keepNext/>
-        <w:spacing w:before="0" w:after="0" w:line="276" w:lineRule="auto"/>
-        <w:jc w:val="both"/>
-        <w:shd w:fill="F4F4F4"/>
-      </w:pPr>
-      <w:r>
-        <w:rPr>
-          <w:b w:val="0"/>
-          <w:sz w:val="24"/>
-          <w:rFonts w:ascii="Times New Roman" w:hAnsi="Times New Roman" w:eastAsia="Times New Roman" w:cs="Times New Roman"/>
-        </w:rPr>
-        <w:t xml:space="preserve">    AND amount IS NOT NULL AND amount &gt;= 0.0;</w:t>
-      </w:r>
-    </w:p>
-    <w:p>
-      <w:pPr>
-        <w:keepNext w:val="0"/>
-        <w:spacing w:before="0" w:after="0" w:line="276" w:lineRule="auto"/>
-        <w:jc w:val="both"/>
-        <w:shd w:fill="F4F4F4"/>
-      </w:pPr>
-      <w:r>
-        <w:rPr>
-          <w:b w:val="0"/>
-          <w:sz w:val="24"/>
-          <w:rFonts w:ascii="Times New Roman" w:hAnsi="Times New Roman" w:eastAsia="Times New Roman" w:cs="Times New Roman"/>
-        </w:rPr>
-        <w:t>STORE clean INTO '$OUTPUT' USING PigStorage('\t');</w:t>
-      </w:r>
-    </w:p>
-    <w:p>
-      <w:pPr>
-        <w:pStyle w:val="Heading2"/>
-        <w:jc w:val="both"/>
-      </w:pPr>
-      <w:r>
-        <w:rPr>
-          <w:rFonts w:ascii="Times New Roman" w:hAnsi="Times New Roman" w:eastAsia="Times New Roman" w:cs="Times New Roman"/>
-          <w:sz w:val="28"/>
-          <w:b/>
-        </w:rPr>
-        <w:t>A.2 Representative Hive query</w:t>
-      </w:r>
-    </w:p>
-    <w:p>
-      <w:pPr>
-        <w:jc w:val="both"/>
-      </w:pPr>
-      <w:r>
-        <w:rPr>
-          <w:b w:val="0"/>
-          <w:sz w:val="24"/>
-          <w:rFonts w:ascii="Times New Roman" w:hAnsi="Times New Roman" w:eastAsia="Times New Roman" w:cs="Times New Roman"/>
-        </w:rPr>
-        <w:t>The query below is applied to both formats by changing TABLE. It is an extract of the nutrient summary query; the execution wrapper also selects the database and disables automatic local execution.</w:t>
-      </w:r>
-    </w:p>
-    <w:p>
-      <w:pPr>
-        <w:keepNext/>
-        <w:spacing w:before="0" w:after="0" w:line="276" w:lineRule="auto"/>
-        <w:jc w:val="both"/>
-        <w:shd w:fill="F4F4F4"/>
-      </w:pPr>
-      <w:r>
-        <w:rPr>
-          <w:b w:val="0"/>
-          <w:sz w:val="24"/>
-          <w:rFonts w:ascii="Times New Roman" w:hAnsi="Times New Roman" w:eastAsia="Times New Roman" w:cs="Times New Roman"/>
-        </w:rPr>
-        <w:t>SELECT data_type, nutrient_id, unit,</w:t>
-      </w:r>
-    </w:p>
-    <w:p>
-      <w:pPr>
-        <w:keepNext/>
-        <w:spacing w:before="0" w:after="0" w:line="276" w:lineRule="auto"/>
-        <w:jc w:val="both"/>
-        <w:shd w:fill="F4F4F4"/>
-      </w:pPr>
-      <w:r>
-        <w:rPr>
-          <w:b w:val="0"/>
-          <w:sz w:val="24"/>
-          <w:rFonts w:ascii="Times New Roman" w:hAnsi="Times New Roman" w:eastAsia="Times New Roman" w:cs="Times New Roman"/>
-        </w:rPr>
-        <w:t xml:space="preserve">       COUNT(*) AS records,</w:t>
-      </w:r>
-    </w:p>
-    <w:p>
-      <w:pPr>
-        <w:keepNext/>
-        <w:spacing w:before="0" w:after="0" w:line="276" w:lineRule="auto"/>
-        <w:jc w:val="both"/>
-        <w:shd w:fill="F4F4F4"/>
-      </w:pPr>
-      <w:r>
-        <w:rPr>
-          <w:b w:val="0"/>
-          <w:sz w:val="24"/>
-          <w:rFonts w:ascii="Times New Roman" w:hAnsi="Times New Roman" w:eastAsia="Times New Roman" w:cs="Times New Roman"/>
-        </w:rPr>
-        <w:t xml:space="preserve">       SUM(amount) AS total_amount,</w:t>
-      </w:r>
-    </w:p>
-    <w:p>
-      <w:pPr>
-        <w:keepNext/>
-        <w:spacing w:before="0" w:after="0" w:line="276" w:lineRule="auto"/>
-        <w:jc w:val="both"/>
-        <w:shd w:fill="F4F4F4"/>
-      </w:pPr>
-      <w:r>
-        <w:rPr>
-          <w:b w:val="0"/>
-          <w:sz w:val="24"/>
-          <w:rFonts w:ascii="Times New Roman" w:hAnsi="Times New Roman" w:eastAsia="Times New Roman" w:cs="Times New Roman"/>
-        </w:rPr>
-        <w:t xml:space="preserve">       AVG(amount) AS mean_amount</w:t>
-      </w:r>
-    </w:p>
-    <w:p>
-      <w:pPr>
-        <w:keepNext/>
-        <w:spacing w:before="0" w:after="0" w:line="276" w:lineRule="auto"/>
-        <w:jc w:val="both"/>
-        <w:shd w:fill="F4F4F4"/>
-      </w:pPr>
-      <w:r>
-        <w:rPr>
-          <w:b w:val="0"/>
-          <w:sz w:val="24"/>
-          <w:rFonts w:ascii="Times New Roman" w:hAnsi="Times New Roman" w:eastAsia="Times New Roman" w:cs="Times New Roman"/>
-        </w:rPr>
-        <w:t>FROM ${hivevar:TABLE}</w:t>
-      </w:r>
-    </w:p>
-    <w:p>
-      <w:pPr>
-        <w:keepNext/>
-        <w:spacing w:before="0" w:after="0" w:line="276" w:lineRule="auto"/>
-        <w:jc w:val="both"/>
-        <w:shd w:fill="F4F4F4"/>
-      </w:pPr>
-      <w:r>
-        <w:rPr>
-          <w:b w:val="0"/>
-          <w:sz w:val="24"/>
-          <w:rFonts w:ascii="Times New Roman" w:hAnsi="Times New Roman" w:eastAsia="Times New Roman" w:cs="Times New Roman"/>
-        </w:rPr>
-        <w:t>WHERE amount &gt;= 0</w:t>
-      </w:r>
-    </w:p>
-    <w:p>
-      <w:pPr>
-        <w:keepNext/>
-        <w:spacing w:before="0" w:after="0" w:line="276" w:lineRule="auto"/>
-        <w:jc w:val="both"/>
-        <w:shd w:fill="F4F4F4"/>
-      </w:pPr>
-      <w:r>
-        <w:rPr>
-          <w:b w:val="0"/>
-          <w:sz w:val="24"/>
-          <w:rFonts w:ascii="Times New Roman" w:hAnsi="Times New Roman" w:eastAsia="Times New Roman" w:cs="Times New Roman"/>
-        </w:rPr>
-        <w:t>GROUP BY data_type, nutrient_id, unit</w:t>
-      </w:r>
-    </w:p>
-    <w:p>
-      <w:pPr>
-        <w:keepNext w:val="0"/>
-        <w:spacing w:before="0" w:after="0" w:line="276" w:lineRule="auto"/>
-        <w:jc w:val="both"/>
-        <w:shd w:fill="F4F4F4"/>
-      </w:pPr>
-      <w:r>
-        <w:rPr>
-          <w:b w:val="0"/>
-          <w:sz w:val="24"/>
-          <w:rFonts w:ascii="Times New Roman" w:hAnsi="Times New Roman" w:eastAsia="Times New Roman" w:cs="Times New Roman"/>
-        </w:rPr>
-        <w:t>ORDER BY data_type, nutrient_id, unit;</w:t>
-      </w:r>
-    </w:p>
-    <w:p>
-      <w:pPr>
-        <w:pStyle w:val="Heading2"/>
-        <w:jc w:val="both"/>
-      </w:pPr>
-      <w:r>
-        <w:rPr>
-          <w:rFonts w:ascii="Times New Roman" w:hAnsi="Times New Roman" w:eastAsia="Times New Roman" w:cs="Times New Roman"/>
-          <w:sz w:val="28"/>
-          <w:b/>
-        </w:rPr>
-        <w:t>A.3 Representative index profiling command</w:t>
-      </w:r>
-    </w:p>
-    <w:p>
-      <w:pPr>
-        <w:jc w:val="both"/>
-      </w:pPr>
-      <w:r>
-        <w:rPr>
-          <w:b w:val="0"/>
-          <w:sz w:val="24"/>
-          <w:rFonts w:ascii="Times New Roman" w:hAnsi="Times New Roman" w:eastAsia="Times New Roman" w:cs="Times New Roman"/>
-        </w:rPr>
-        <w:t>The Python implementation issues the equivalent explain command and retains every response. The indexed and baseline filters select the same food ID; the identifier below is a placeholder to replace with an existing record.</w:t>
-      </w:r>
-    </w:p>
-    <w:p>
-      <w:pPr>
-        <w:keepNext/>
-        <w:spacing w:before="0" w:after="0" w:line="276" w:lineRule="auto"/>
-        <w:jc w:val="both"/>
-        <w:shd w:fill="F4F4F4"/>
-      </w:pPr>
-      <w:r>
-        <w:rPr>
-          <w:b w:val="0"/>
-          <w:sz w:val="24"/>
-          <w:rFonts w:ascii="Times New Roman" w:hAnsi="Times New Roman" w:eastAsia="Times New Roman" w:cs="Times New Roman"/>
-        </w:rPr>
-        <w:t>db.raw_food.find({fdc_id: '&lt;existing-food-id&gt;'})</w:t>
-      </w:r>
-    </w:p>
-    <w:p>
-      <w:pPr>
-        <w:keepNext w:val="0"/>
-        <w:spacing w:before="0" w:after="0" w:line="276" w:lineRule="auto"/>
-        <w:jc w:val="both"/>
-        <w:shd w:fill="F4F4F4"/>
-      </w:pPr>
-      <w:r>
-        <w:rPr>
-          <w:b w:val="0"/>
-          <w:sz w:val="24"/>
-          <w:rFonts w:ascii="Times New Roman" w:hAnsi="Times New Roman" w:eastAsia="Times New Roman" w:cs="Times New Roman"/>
-        </w:rPr>
-        <w:t xml:space="preserve">  .hint('idx_fdc_id').explain('executionStats')</w:t>
-      </w:r>
-    </w:p>
-    <w:p>
-      <w:pPr>
-        <w:jc w:val="both"/>
-      </w:pPr>
-      <w:r>
-        <w:rPr>
-          <w:b w:val="0"/>
-          <w:sz w:val="24"/>
-          <w:rFonts w:ascii="Times New Roman" w:hAnsi="Times New Roman" w:eastAsia="Times New Roman" w:cs="Times New Roman"/>
-        </w:rPr>
-        <w:t>The actual source CSV food identifiers are retained as strings in the raw MongoDB collections. Derived and prepared analytical identifiers are converted as required by their schemas. This distinction explains why the shell example quotes the raw identifier.</w:t>
-      </w:r>
-    </w:p>
-    <w:p>
-      <w:bookmarkStart w:id="24" w:name="chapter_12"/>
-      <w:pPr>
-        <w:pStyle w:val="Heading1"/>
-        <w:pageBreakBefore/>
-        <w:jc w:val="both"/>
-      </w:pPr>
-      <w:r>
-        <w:rPr>
-          <w:rFonts w:ascii="Times New Roman" w:hAnsi="Times New Roman" w:eastAsia="Times New Roman" w:cs="Times New Roman"/>
-          <w:sz w:val="28"/>
-          <w:b/>
-        </w:rPr>
-        <w:t>APPENDIX B: EVIDENCE AND SUBMISSION CHECKLIST</w:t>
-      </w:r>
-      <w:bookmarkEnd w:id="24"/>
-    </w:p>
-    <w:p>
-      <w:pPr>
-        <w:pStyle w:val="Heading2"/>
-        <w:jc w:val="both"/>
-      </w:pPr>
-      <w:r>
-        <w:rPr>
-          <w:rFonts w:ascii="Times New Roman" w:hAnsi="Times New Roman" w:eastAsia="Times New Roman" w:cs="Times New Roman"/>
-          <w:sz w:val="28"/>
-          <w:b/>
-        </w:rPr>
-        <w:t>B.1 Key artifacts</w:t>
-      </w:r>
-    </w:p>
-    <w:p>
-      <w:bookmarkStart w:id="25" w:name="table_9"/>
-      <w:pPr>
-        <w:keepNext/>
-        <w:spacing w:before="80" w:after="120"/>
-        <w:jc w:val="both"/>
-      </w:pPr>
-      <w:r>
-        <w:rPr>
-          <w:b w:val="0"/>
-          <w:sz w:val="24"/>
-          <w:rFonts w:ascii="Times New Roman" w:hAnsi="Times New Roman" w:eastAsia="Times New Roman" w:cs="Times New Roman"/>
-        </w:rPr>
-        <w:t>Table B.1 — Run artifacts and their purpose</w:t>
-      </w:r>
-      <w:bookmarkEnd w:id="25"/>
-    </w:p>
-    <w:tbl>
-      <w:tblPr>
-        <w:tblStyle w:val="TableGrid"/>
-        <w:tblW w:type="auto" w:w="0"/>
-        <w:jc w:val="left"/>
-        <w:tblLayout w:type="fixed"/>
-        <w:tblLook w:firstColumn="1" w:firstRow="1" w:lastColumn="0" w:lastRow="0" w:noHBand="0" w:noVBand="1" w:val="04A0"/>
-      </w:tblPr>
-      <w:tblGrid>
-        <w:gridCol w:w="3288"/>
-        <w:gridCol w:w="5613"/>
-      </w:tblGrid>
-      <w:tr>
-        <w:trPr>
-          <w:cantSplit/>
-          <w:tblHeader/>
-        </w:trPr>
-        <w:tc>
-          <w:tcPr>
-            <w:tcW w:type="dxa" w:w="3288"/>
-            <w:shd w:fill="EEEEEE"/>
-          </w:tcPr>
-          <w:p>
-            <w:pPr>
-              <w:spacing w:after="60" w:before="60" w:line="360" w:lineRule="auto"/>
-              <w:jc w:val="both"/>
-            </w:pPr>
-            <w:r>
-              <w:rPr>
-                <w:b/>
-                <w:sz w:val="24"/>
-                <w:rFonts w:ascii="Times New Roman" w:hAnsi="Times New Roman" w:eastAsia="Times New Roman" w:cs="Times New Roman"/>
-              </w:rPr>
-              <w:t>Artifact</w:t>
-            </w:r>
-          </w:p>
-        </w:tc>
-        <w:tc>
-          <w:tcPr>
-            <w:tcW w:type="dxa" w:w="5613"/>
-            <w:shd w:fill="EEEEEE"/>
-          </w:tcPr>
-          <w:p>
-            <w:pPr>
-              <w:spacing w:after="60" w:before="60" w:line="360" w:lineRule="auto"/>
-              <w:jc w:val="both"/>
-            </w:pPr>
-            <w:r>
-              <w:rPr>
-                <w:b/>
-                <w:sz w:val="24"/>
-                <w:rFonts w:ascii="Times New Roman" w:hAnsi="Times New Roman" w:eastAsia="Times New Roman" w:cs="Times New Roman"/>
-              </w:rPr>
-              <w:t>What it establishes</w:t>
-            </w:r>
-          </w:p>
-        </w:tc>
-      </w:tr>
-      <w:tr>
-        <w:trPr>
-          <w:cantSplit/>
-        </w:trPr>
-        <w:tc>
-          <w:tcPr>
-            <w:tcW w:type="dxa" w:w="3288"/>
-          </w:tcPr>
-          <w:p>
-            <w:pPr>
-              <w:spacing w:after="60" w:before="60" w:line="360" w:lineRule="auto"/>
-              <w:jc w:val="both"/>
-            </w:pPr>
-            <w:r>
-              <w:rPr>
-                <w:b w:val="0"/>
-                <w:sz w:val="24"/>
-                <w:rFonts w:ascii="Times New Roman" w:hAnsi="Times New Roman" w:eastAsia="Times New Roman" w:cs="Times New Roman"/>
-              </w:rPr>
-              <w:t>manifest.json</w:t>
-            </w:r>
-          </w:p>
-        </w:tc>
-        <w:tc>
-          <w:tcPr>
-            <w:tcW w:type="dxa" w:w="5613"/>
-          </w:tcPr>
-          <w:p>
-            <w:pPr>
-              <w:spacing w:after="60" w:before="60" w:line="360" w:lineRule="auto"/>
-              <w:jc w:val="both"/>
-            </w:pPr>
-            <w:r>
-              <w:rPr>
-                <w:b w:val="0"/>
-                <w:sz w:val="24"/>
-                <w:rFonts w:ascii="Times New Roman" w:hAnsi="Times New Roman" w:eastAsia="Times New Roman" w:cs="Times New Roman"/>
-              </w:rPr>
-              <w:t>Preparation counts, columns and source hash</w:t>
-            </w:r>
-          </w:p>
-        </w:tc>
-      </w:tr>
-      <w:tr>
-        <w:trPr>
-          <w:cantSplit/>
-        </w:trPr>
-        <w:tc>
-          <w:tcPr>
-            <w:tcW w:type="dxa" w:w="3288"/>
-          </w:tcPr>
-          <w:p>
-            <w:pPr>
-              <w:spacing w:after="60" w:before="60" w:line="360" w:lineRule="auto"/>
-              <w:jc w:val="both"/>
-            </w:pPr>
-            <w:r>
-              <w:rPr>
-                <w:b w:val="0"/>
-                <w:sz w:val="24"/>
-                <w:rFonts w:ascii="Times New Roman" w:hAnsi="Times New Roman" w:eastAsia="Times New Roman" w:cs="Times New Roman"/>
-              </w:rPr>
-              <w:t>MongoDB import metadata</w:t>
-            </w:r>
-          </w:p>
-        </w:tc>
-        <w:tc>
-          <w:tcPr>
-            <w:tcW w:type="dxa" w:w="5613"/>
-          </w:tcPr>
-          <w:p>
-            <w:pPr>
-              <w:spacing w:after="60" w:before="60" w:line="360" w:lineRule="auto"/>
-              <w:jc w:val="both"/>
-            </w:pPr>
-            <w:r>
-              <w:rPr>
-                <w:b w:val="0"/>
-                <w:sz w:val="24"/>
-                <w:rFonts w:ascii="Times New Roman" w:hAnsi="Times New Roman" w:eastAsia="Times New Roman" w:cs="Times New Roman"/>
-              </w:rPr>
-              <w:t>Collection inventory and completion</w:t>
-            </w:r>
-          </w:p>
-        </w:tc>
-      </w:tr>
-      <w:tr>
-        <w:trPr>
-          <w:cantSplit/>
-        </w:trPr>
-        <w:tc>
-          <w:tcPr>
-            <w:tcW w:type="dxa" w:w="3288"/>
-          </w:tcPr>
-          <w:p>
-            <w:pPr>
-              <w:spacing w:after="60" w:before="60" w:line="360" w:lineRule="auto"/>
-              <w:jc w:val="both"/>
-            </w:pPr>
-            <w:r>
-              <w:rPr>
-                <w:b w:val="0"/>
-                <w:sz w:val="24"/>
-                <w:rFonts w:ascii="Times New Roman" w:hAnsi="Times New Roman" w:eastAsia="Times New Roman" w:cs="Times New Roman"/>
-              </w:rPr>
-              <w:t>profile.json</w:t>
-            </w:r>
-          </w:p>
-        </w:tc>
-        <w:tc>
-          <w:tcPr>
-            <w:tcW w:type="dxa" w:w="5613"/>
-          </w:tcPr>
-          <w:p>
-            <w:pPr>
-              <w:spacing w:after="60" w:before="60" w:line="360" w:lineRule="auto"/>
-              <w:jc w:val="both"/>
-            </w:pPr>
-            <w:r>
-              <w:rPr>
-                <w:b w:val="0"/>
-                <w:sz w:val="24"/>
-                <w:rFonts w:ascii="Times New Roman" w:hAnsi="Times New Roman" w:eastAsia="Times New Roman" w:cs="Times New Roman"/>
-              </w:rPr>
-              <w:t>Repeated explain results and dataset scope</w:t>
-            </w:r>
-          </w:p>
-        </w:tc>
-      </w:tr>
-      <w:tr>
-        <w:trPr>
-          <w:cantSplit/>
-        </w:trPr>
-        <w:tc>
-          <w:tcPr>
-            <w:tcW w:type="dxa" w:w="3288"/>
-          </w:tcPr>
-          <w:p>
-            <w:pPr>
-              <w:spacing w:after="60" w:before="60" w:line="360" w:lineRule="auto"/>
-              <w:jc w:val="both"/>
-            </w:pPr>
-            <w:r>
-              <w:rPr>
-                <w:b w:val="0"/>
-                <w:sz w:val="24"/>
-                <w:rFonts w:ascii="Times New Roman" w:hAnsi="Times New Roman" w:eastAsia="Times New Roman" w:cs="Times New Roman"/>
-              </w:rPr>
-              <w:t>activity.json / operation.json</w:t>
-            </w:r>
-          </w:p>
-        </w:tc>
-        <w:tc>
-          <w:tcPr>
-            <w:tcW w:type="dxa" w:w="5613"/>
-          </w:tcPr>
-          <w:p>
-            <w:pPr>
-              <w:spacing w:after="60" w:before="60" w:line="360" w:lineRule="auto"/>
-              <w:jc w:val="both"/>
-            </w:pPr>
-            <w:r>
-              <w:rPr>
-                <w:b w:val="0"/>
-                <w:sz w:val="24"/>
-                <w:rFonts w:ascii="Times New Roman" w:hAnsi="Times New Roman" w:eastAsia="Times New Roman" w:cs="Times New Roman"/>
-              </w:rPr>
-              <w:t>Detailed stages and current/latest operation</w:t>
-            </w:r>
-          </w:p>
-        </w:tc>
-      </w:tr>
-      <w:tr>
-        <w:trPr>
-          <w:cantSplit/>
-        </w:trPr>
-        <w:tc>
-          <w:tcPr>
-            <w:tcW w:type="dxa" w:w="3288"/>
-          </w:tcPr>
-          <w:p>
-            <w:pPr>
-              <w:spacing w:after="60" w:before="60" w:line="360" w:lineRule="auto"/>
-              <w:jc w:val="both"/>
-            </w:pPr>
-            <w:r>
-              <w:rPr>
-                <w:b w:val="0"/>
-                <w:sz w:val="24"/>
-                <w:rFonts w:ascii="Times New Roman" w:hAnsi="Times New Roman" w:eastAsia="Times New Roman" w:cs="Times New Roman"/>
-              </w:rPr>
-              <w:t>cluster.log</w:t>
-            </w:r>
-          </w:p>
-        </w:tc>
-        <w:tc>
-          <w:tcPr>
-            <w:tcW w:type="dxa" w:w="5613"/>
-          </w:tcPr>
-          <w:p>
-            <w:pPr>
-              <w:spacing w:after="60" w:before="60" w:line="360" w:lineRule="auto"/>
-              <w:jc w:val="both"/>
-            </w:pPr>
-            <w:r>
-              <w:rPr>
-                <w:b w:val="0"/>
-                <w:sz w:val="24"/>
-                <w:rFonts w:ascii="Times New Roman" w:hAnsi="Times New Roman" w:eastAsia="Times New Roman" w:cs="Times New Roman"/>
-              </w:rPr>
-              <w:t>Commands and distributed diagnostics</w:t>
-            </w:r>
-          </w:p>
-        </w:tc>
-      </w:tr>
-      <w:tr>
-        <w:trPr>
-          <w:cantSplit/>
-        </w:trPr>
-        <w:tc>
-          <w:tcPr>
-            <w:tcW w:type="dxa" w:w="3288"/>
-          </w:tcPr>
-          <w:p>
-            <w:pPr>
-              <w:spacing w:after="60" w:before="60" w:line="360" w:lineRule="auto"/>
-              <w:jc w:val="both"/>
-            </w:pPr>
-            <w:r>
-              <w:rPr>
-                <w:b w:val="0"/>
-                <w:sz w:val="24"/>
-                <w:rFonts w:ascii="Times New Roman" w:hAnsi="Times New Roman" w:eastAsia="Times New Roman" w:cs="Times New Roman"/>
-              </w:rPr>
-              <w:t>mapreduce.tsv</w:t>
-            </w:r>
-          </w:p>
-        </w:tc>
-        <w:tc>
-          <w:tcPr>
-            <w:tcW w:type="dxa" w:w="5613"/>
-          </w:tcPr>
-          <w:p>
-            <w:pPr>
-              <w:spacing w:after="60" w:before="60" w:line="360" w:lineRule="auto"/>
-              <w:jc w:val="both"/>
-            </w:pPr>
-            <w:r>
-              <w:rPr>
-                <w:b w:val="0"/>
-                <w:sz w:val="24"/>
-                <w:rFonts w:ascii="Times New Roman" w:hAnsi="Times New Roman" w:eastAsia="Times New Roman" w:cs="Times New Roman"/>
-              </w:rPr>
-              <w:t>Reducer counts, totals and means</w:t>
-            </w:r>
-          </w:p>
-        </w:tc>
-      </w:tr>
-      <w:tr>
-        <w:trPr>
-          <w:cantSplit/>
-        </w:trPr>
-        <w:tc>
-          <w:tcPr>
-            <w:tcW w:type="dxa" w:w="3288"/>
-          </w:tcPr>
-          <w:p>
-            <w:pPr>
-              <w:spacing w:after="60" w:before="60" w:line="360" w:lineRule="auto"/>
-              <w:jc w:val="both"/>
-            </w:pPr>
-            <w:r>
-              <w:rPr>
-                <w:b w:val="0"/>
-                <w:sz w:val="24"/>
-                <w:rFonts w:ascii="Times New Roman" w:hAnsi="Times New Roman" w:eastAsia="Times New Roman" w:cs="Times New Roman"/>
-              </w:rPr>
-              <w:t>hive/benchmark.json</w:t>
-            </w:r>
-          </w:p>
-        </w:tc>
-        <w:tc>
-          <w:tcPr>
-            <w:tcW w:type="dxa" w:w="5613"/>
-          </w:tcPr>
-          <w:p>
-            <w:pPr>
-              <w:spacing w:after="60" w:before="60" w:line="360" w:lineRule="auto"/>
-              <w:jc w:val="both"/>
-            </w:pPr>
-            <w:r>
-              <w:rPr>
-                <w:b w:val="0"/>
-                <w:sz w:val="24"/>
-                <w:rFonts w:ascii="Times New Roman" w:hAnsi="Times New Roman" w:eastAsia="Times New Roman" w:cs="Times New Roman"/>
-              </w:rPr>
-              <w:t>Query equality, timings and storage</w:t>
-            </w:r>
-          </w:p>
-        </w:tc>
-      </w:tr>
-      <w:tr>
-        <w:trPr>
-          <w:cantSplit/>
-        </w:trPr>
-        <w:tc>
-          <w:tcPr>
-            <w:tcW w:type="dxa" w:w="3288"/>
-          </w:tcPr>
-          <w:p>
-            <w:pPr>
-              <w:spacing w:after="60" w:before="60" w:line="360" w:lineRule="auto"/>
-              <w:jc w:val="both"/>
-            </w:pPr>
-            <w:r>
-              <w:rPr>
-                <w:b w:val="0"/>
-                <w:sz w:val="24"/>
-                <w:rFonts w:ascii="Times New Roman" w:hAnsi="Times New Roman" w:eastAsia="Times New Roman" w:cs="Times New Roman"/>
-              </w:rPr>
-              <w:t>SUCCESS.json</w:t>
-            </w:r>
-          </w:p>
-        </w:tc>
-        <w:tc>
-          <w:tcPr>
-            <w:tcW w:type="dxa" w:w="5613"/>
-          </w:tcPr>
-          <w:p>
-            <w:pPr>
-              <w:spacing w:after="60" w:before="60" w:line="360" w:lineRule="auto"/>
-              <w:jc w:val="both"/>
-            </w:pPr>
-            <w:r>
-              <w:rPr>
-                <w:b w:val="0"/>
-                <w:sz w:val="24"/>
-                <w:rFonts w:ascii="Times New Roman" w:hAnsi="Times New Roman" w:eastAsia="Times New Roman" w:cs="Times New Roman"/>
-              </w:rPr>
-              <w:t>Completed development integration marker</w:t>
-            </w:r>
-          </w:p>
-        </w:tc>
-      </w:tr>
-      <w:tr>
-        <w:trPr>
-          <w:cantSplit/>
-        </w:trPr>
-        <w:tc>
-          <w:tcPr>
-            <w:tcW w:type="dxa" w:w="3288"/>
-          </w:tcPr>
-          <w:p>
-            <w:pPr>
-              <w:spacing w:after="60" w:before="60" w:line="360" w:lineRule="auto"/>
-              <w:jc w:val="both"/>
-            </w:pPr>
-            <w:r>
-              <w:rPr>
-                <w:b w:val="0"/>
-                <w:sz w:val="24"/>
-                <w:rFonts w:ascii="Times New Roman" w:hAnsi="Times New Roman" w:eastAsia="Times New Roman" w:cs="Times New Roman"/>
-              </w:rPr>
-              <w:t>run.json / reconciliation.json</w:t>
-            </w:r>
-          </w:p>
-        </w:tc>
-        <w:tc>
-          <w:tcPr>
-            <w:tcW w:type="dxa" w:w="5613"/>
-          </w:tcPr>
-          <w:p>
-            <w:pPr>
-              <w:spacing w:after="60" w:before="60" w:line="360" w:lineRule="auto"/>
-              <w:jc w:val="both"/>
-            </w:pPr>
-            <w:r>
-              <w:rPr>
-                <w:b w:val="0"/>
-                <w:sz w:val="24"/>
-                <w:rFonts w:ascii="Times New Roman" w:hAnsi="Times New Roman" w:eastAsia="Times New Roman" w:cs="Times New Roman"/>
-              </w:rPr>
-              <w:t>Full-run stages and independent checks</w:t>
-            </w:r>
-          </w:p>
-        </w:tc>
-      </w:tr>
-    </w:tbl>
-    <w:p>
-      <w:pPr>
-        <w:pStyle w:val="Heading2"/>
-        <w:jc w:val="both"/>
-      </w:pPr>
-      <w:r>
-        <w:rPr>
-          <w:rFonts w:ascii="Times New Roman" w:hAnsi="Times New Roman" w:eastAsia="Times New Roman" w:cs="Times New Roman"/>
-          <w:sz w:val="28"/>
-          <w:b/>
-        </w:rPr>
-        <w:t>B.2 Items to complete before submission</w:t>
-      </w:r>
-    </w:p>
-    <w:p>
-      <w:pPr>
-        <w:jc w:val="both"/>
-      </w:pPr>
-      <w:r>
-        <w:rPr>
-          <w:b w:val="0"/>
-          <w:sz w:val="24"/>
-          <w:rFonts w:ascii="Times New Roman" w:hAnsi="Times New Roman" w:eastAsia="Times New Roman" w:cs="Times New Roman"/>
-        </w:rPr>
-        <w:t>Confirm the supplied college, department, team names, USNs, guide and academic year. Obtain any signatures or marks required by the college. Insert the original laptop or college benchmark measurements and authentic screenshots. Complete the full-data run on the required physical systems and retain its application/task evidence. Update the contents page after any edits that change pagination.</w:t>
-      </w:r>
-    </w:p>
-    <w:p>
-      <w:pPr>
-        <w:jc w:val="both"/>
-      </w:pPr>
-      <w:r>
-        <w:rPr>
-          <w:b w:val="0"/>
-          <w:sz w:val="24"/>
-          <w:rFonts w:ascii="Times New Roman" w:hAnsi="Times New Roman" w:eastAsia="Times New Roman" w:cs="Times New Roman"/>
-        </w:rPr>
-        <w:t>The cover signature and marks fields are intentionally blank for the appropriate students and faculty to complete. The formatting uses A4 pages, Times New Roman, bold 14-point headings, 12-point text, justified paragraphs and 1.5-line body spacing. The supplied Cloud Report was used for the cover structure, emblems and department header/footer; its cloud-course content and former guide details were not carried into this report.</w:t>
+        <w:t>[9] Dhanush-singh-g, “BDA-Assignment,” https://github.com/Dhanush-singh-g/BDA-Assignment . Project implementation, architecture, deployment documentation and validation record.</w:t>
       </w:r>
     </w:p>
     <w:sectPr>

</xml_diff>